<commit_message>
docs: tidy thePlayer guide layout
</commit_message>
<xml_diff>
--- a/docs/thePlayer/tests/thePlayer-guide.docx
+++ b/docs/thePlayer/tests/thePlayer-guide.docx
@@ -2,7 +2,7 @@
 <file path=word/document.xml><?xml version="1.0" encoding="utf-8"?>
 <w:document xmlns:w="http://schemas.openxmlformats.org/wordprocessingml/2006/main" xmlns:m="http://schemas.openxmlformats.org/officeDocument/2006/math" xmlns:r="http://schemas.openxmlformats.org/officeDocument/2006/relationships" xmlns:o="urn:schemas-microsoft-com:office:office" xmlns:v="urn:schemas-microsoft-com:vml" xmlns:w10="urn:schemas-microsoft-com:office:word" xmlns:a="http://schemas.openxmlformats.org/drawingml/2006/main" xmlns:pic="http://schemas.openxmlformats.org/drawingml/2006/picture" xmlns:wp="http://schemas.openxmlformats.org/drawingml/2006/wordprocessingDrawing">
   <w:body>
-    <w:bookmarkStart w:id="54" w:name="终极玩家操作流程"/>
+    <w:bookmarkStart w:id="57" w:name="终极玩家操作流程"/>
     <w:p>
       <w:pPr>
         <w:pStyle w:val="Heading1"/>
@@ -725,7 +725,7 @@
         <w:pStyle w:val="Heading3"/>
       </w:pPr>
       <w:r>
-        <w:t xml:space="preserve">5. 邀请列表</w:t>
+        <w:t xml:space="preserve">6. 邀请列表</w:t>
       </w:r>
     </w:p>
     <w:p>
@@ -1276,178 +1276,448 @@
         <w:pStyle w:val="FirstParagraph"/>
       </w:pPr>
       <w:r>
-        <w:t xml:space="preserve">通过以上步骤，即可完成完整的玩家购票、收益查看、空投领取流程，以及管理员的调参、注资、结算与新轮开启。整个操作不需要修改代码，只需按照页面提示点击对应按钮即可。***</w:t>
-      </w:r>
-      <w:r>
-        <w:t xml:space="preserve"> </w:t>
-      </w:r>
-      <w:r>
-        <w:t xml:space="preserve">地址</w:t>
-      </w:r>
-      <w:r>
-        <w:t xml:space="preserve"> </w:t>
-      </w:r>
-      <w:r>
-        <w:t xml:space="preserve">私钥</w:t>
-      </w:r>
-      <w:r>
-        <w:t xml:space="preserve"> </w:t>
-      </w:r>
-      <w:r>
-        <w:t xml:space="preserve">管理员地址 0x6c62d0c68071335f6fdf7bfe7d866659ad1b0061</w:t>
-      </w:r>
-      <w:r>
-        <w:t xml:space="preserve"> </w:t>
-      </w:r>
-      <w:r>
-        <w:t xml:space="preserve">7cc046fe6c3a6528d9861d1d162edadb90cd818a584c705d172b7d619bdde140</w:t>
-      </w:r>
-      <w:r>
-        <w:t xml:space="preserve"> </w:t>
-      </w:r>
-      <w:r>
-        <w:t xml:space="preserve">开发者国库地址：</w:t>
-      </w:r>
-      <w:r>
-        <w:t xml:space="preserve"> </w:t>
-      </w:r>
-      <w:r>
-        <w:t xml:space="preserve">treasury 0x8224fbbdc261759cbf861c16394a9141c5575c25</w:t>
-      </w:r>
-      <w:r>
-        <w:t xml:space="preserve"> </w:t>
-      </w:r>
-      <w:r>
-        <w:t xml:space="preserve">d74168aed1725675c2041c4d34bdfa32530ee6575241354ef6b84963a571e59c</w:t>
-      </w:r>
-    </w:p>
-    <w:p>
-      <w:pPr>
-        <w:pStyle w:val="BodyText"/>
-      </w:pPr>
-      <w:r>
-        <w:t xml:space="preserve">社区基金地址</w:t>
-      </w:r>
-      <w:r>
-        <w:t xml:space="preserve"> </w:t>
-      </w:r>
-      <w:r>
-        <w:t xml:space="preserve">communityFund_ 0xb11b018c1d6f093cbe5e50e76fd9ed4c70f90c79</w:t>
-      </w:r>
-      <w:r>
-        <w:t xml:space="preserve"> </w:t>
-      </w:r>
-      <w:r>
-        <w:t xml:space="preserve">9e7d9b96c2306237b8c1ff8ee4094c03761b835f183f6519b3a7567f7c4bcd02</w:t>
-      </w:r>
-    </w:p>
-    <w:p>
-      <w:pPr>
-        <w:pStyle w:val="BodyText"/>
-      </w:pPr>
-      <w:r>
-        <w:t xml:space="preserve">这是测试推荐关系的地址</w:t>
-      </w:r>
-      <w:r>
-        <w:t xml:space="preserve"> </w:t>
-      </w:r>
-      <w:r>
-        <w:t xml:space="preserve">买票人 0x122e268a49b3b617af62be87393b214894c7a674</w:t>
-      </w:r>
-      <w:r>
-        <w:t xml:space="preserve"> </w:t>
-      </w:r>
-      <w:r>
-        <w:t xml:space="preserve">89cc918e6bdb4c46c49c8a3c5f2807f98f55109fa64d088fcbdef6099a47a89a</w:t>
-      </w:r>
-      <w:r>
-        <w:t xml:space="preserve"> </w:t>
-      </w:r>
-      <w:r>
-        <w:t xml:space="preserve">邀请人 0x2cf5446b1d01fbf0be6e895f1c26b2a6a40ad3d7</w:t>
-      </w:r>
-      <w:r>
-        <w:t xml:space="preserve"> </w:t>
-      </w:r>
-      <w:r>
-        <w:t xml:space="preserve">113f848e2c433dcefd7bd62227fcda34269e12f138ebf430189277a63ecbdacb</w:t>
-      </w:r>
-    </w:p>
-    <w:p>
-      <w:pPr>
-        <w:pStyle w:val="BodyText"/>
-      </w:pPr>
-      <w:r>
-        <w:t xml:space="preserve">间接邀请人 0xb8ee25e6f4e993406180fe9fdfca0c935605a39c</w:t>
-      </w:r>
-      <w:r>
-        <w:t xml:space="preserve"> </w:t>
-      </w:r>
-      <w:r>
-        <w:t xml:space="preserve">fa3cdf14159a270ca6da44567b3d99dfcbe007f42b8bceab62e01110fc57ba84</w:t>
-      </w:r>
-    </w:p>
-    <w:p>
-      <w:pPr>
-        <w:pStyle w:val="BodyText"/>
-      </w:pPr>
-      <w:r>
-        <w:t xml:space="preserve">这是管理员添加的三个地址：</w:t>
-      </w:r>
-    </w:p>
-    <w:p>
-      <w:pPr>
-        <w:pStyle w:val="BodyText"/>
-      </w:pPr>
-      <w:r>
-        <w:t xml:space="preserve">1 0x9e77389505ccd3d89e11109b3ec96d8458603ffe</w:t>
-      </w:r>
-      <w:r>
-        <w:t xml:space="preserve"> </w:t>
-      </w:r>
-      <w:r>
-        <w:t xml:space="preserve">418fd094258cd4f17e8ad197fe07e15321c3f07deac1b59cea98cf6342ae4549</w:t>
-      </w:r>
-    </w:p>
-    <w:p>
-      <w:pPr>
-        <w:pStyle w:val="BodyText"/>
-      </w:pPr>
-      <w:r>
-        <w:t xml:space="preserve">2 0xdf122a018c12d6129205f98a8c8758f4f2ff37c3</w:t>
-      </w:r>
-      <w:r>
-        <w:t xml:space="preserve"> </w:t>
-      </w:r>
-      <w:r>
-        <w:t xml:space="preserve">1fe977553945e7a7d960654020cb8b378229bf42607ad174616732ba04886533</w:t>
-      </w:r>
-    </w:p>
-    <w:p>
-      <w:pPr>
-        <w:pStyle w:val="BodyText"/>
-      </w:pPr>
-      <w:r>
-        <w:t xml:space="preserve">3 0x02b6438f76d32d6195f25e122af0a71d9067f9f8</w:t>
-      </w:r>
-      <w:r>
-        <w:t xml:space="preserve"> </w:t>
-      </w:r>
-      <w:r>
-        <w:t xml:space="preserve">93bc67ddaea266c3fcba97d2fd146972d8f60d52d5e4cc0d0e7cdb5604cab442</w:t>
-      </w:r>
-    </w:p>
-    <w:p>
-      <w:pPr>
-        <w:pStyle w:val="BodyText"/>
-      </w:pPr>
-      <w:r>
-        <w:t xml:space="preserve">usdt的地址 0x26dd16D5B9708032872a7cD10C100b0FcE4E79a9</w:t>
+        <w:t xml:space="preserve">通过以上步骤，即可完成完整的玩家购票、收益查看、空投领取流程，以及管理员的调参、注资、结算与新轮开启。整个操作不需要修改代码，只需按照页面提示点击对应按钮即可。</w:t>
+      </w:r>
+    </w:p>
+    <w:p>
+      <w:r>
+        <w:pict>
+          <v:rect style="width:0;height:1.5pt" o:hralign="center" o:hrstd="t" o:hr="t"/>
+        </w:pict>
       </w:r>
     </w:p>
     <w:bookmarkEnd w:id="52"/>
     <w:bookmarkEnd w:id="53"/>
+    <w:bookmarkStart w:id="56" w:name="测试数据与地址请勿暴露生产环境"/>
+    <w:p>
+      <w:pPr>
+        <w:pStyle w:val="Heading2"/>
+      </w:pPr>
+      <w:r>
+        <w:t xml:space="preserve">测试数据与地址（请勿暴露生产环境）</w:t>
+      </w:r>
+    </w:p>
+    <w:p>
+      <w:pPr>
+        <w:pStyle w:val="BlockText"/>
+      </w:pPr>
+      <w:r>
+        <w:t xml:space="preserve">仅供测试使用，包含私钥和敏感地址，请勿泄露或在主网使用。</w:t>
+      </w:r>
+    </w:p>
+    <w:p>
+      <w:pPr>
+        <w:pStyle w:val="Compact"/>
+        <w:numPr>
+          <w:ilvl w:val="0"/>
+          <w:numId w:val="1016"/>
+        </w:numPr>
+      </w:pPr>
+      <w:r>
+        <w:rPr>
+          <w:b/>
+          <w:bCs/>
+        </w:rPr>
+        <w:t xml:space="preserve">管理员地址</w:t>
+      </w:r>
+      <w:r>
+        <w:t xml:space="preserve">：</w:t>
+      </w:r>
+      <w:r>
+        <w:rPr>
+          <w:rStyle w:val="VerbatimChar"/>
+        </w:rPr>
+        <w:t xml:space="preserve">0x6c62d0c68071335f6fdf7bfe7d866659ad1b0061</w:t>
+      </w:r>
+      <w:r>
+        <w:br/>
+      </w:r>
+      <w:r>
+        <w:rPr>
+          <w:b/>
+          <w:bCs/>
+        </w:rPr>
+        <w:t xml:space="preserve">管理员私钥</w:t>
+      </w:r>
+      <w:r>
+        <w:t xml:space="preserve">：</w:t>
+      </w:r>
+      <w:r>
+        <w:rPr>
+          <w:rStyle w:val="VerbatimChar"/>
+        </w:rPr>
+        <w:t xml:space="preserve">7cc046fe6c3a6528d9861d1d162edadb90cd818a584c705d172b7d619bdde140</w:t>
+      </w:r>
+    </w:p>
+    <w:p>
+      <w:pPr>
+        <w:pStyle w:val="Compact"/>
+        <w:numPr>
+          <w:ilvl w:val="0"/>
+          <w:numId w:val="1016"/>
+        </w:numPr>
+      </w:pPr>
+      <w:r>
+        <w:rPr>
+          <w:b/>
+          <w:bCs/>
+        </w:rPr>
+        <w:t xml:space="preserve">开发者国库地址</w:t>
+      </w:r>
+      <w:r>
+        <w:t xml:space="preserve">：</w:t>
+      </w:r>
+      <w:r>
+        <w:rPr>
+          <w:rStyle w:val="VerbatimChar"/>
+        </w:rPr>
+        <w:t xml:space="preserve">0x8224fbbdc261759cbf861c16394a9141c5575c25</w:t>
+      </w:r>
+      <w:r>
+        <w:br/>
+      </w:r>
+      <w:r>
+        <w:rPr>
+          <w:b/>
+          <w:bCs/>
+        </w:rPr>
+        <w:t xml:space="preserve">私钥</w:t>
+      </w:r>
+      <w:r>
+        <w:t xml:space="preserve">：</w:t>
+      </w:r>
+      <w:r>
+        <w:rPr>
+          <w:rStyle w:val="VerbatimChar"/>
+        </w:rPr>
+        <w:t xml:space="preserve">d74168aed1725675c2041c4d34bdfa32530ee6575241354ef6b84963a571e59c</w:t>
+      </w:r>
+    </w:p>
+    <w:p>
+      <w:pPr>
+        <w:pStyle w:val="Compact"/>
+        <w:numPr>
+          <w:ilvl w:val="0"/>
+          <w:numId w:val="1016"/>
+        </w:numPr>
+      </w:pPr>
+      <w:r>
+        <w:rPr>
+          <w:b/>
+          <w:bCs/>
+        </w:rPr>
+        <w:t xml:space="preserve">社区基金地址</w:t>
+      </w:r>
+      <w:r>
+        <w:t xml:space="preserve">：</w:t>
+      </w:r>
+      <w:r>
+        <w:rPr>
+          <w:rStyle w:val="VerbatimChar"/>
+        </w:rPr>
+        <w:t xml:space="preserve">0xb11b018c1d6f093cbe5e50e76fd9ed4c70f90c79</w:t>
+      </w:r>
+      <w:r>
+        <w:br/>
+      </w:r>
+      <w:r>
+        <w:rPr>
+          <w:b/>
+          <w:bCs/>
+        </w:rPr>
+        <w:t xml:space="preserve">私钥</w:t>
+      </w:r>
+      <w:r>
+        <w:t xml:space="preserve">：</w:t>
+      </w:r>
+      <w:r>
+        <w:rPr>
+          <w:rStyle w:val="VerbatimChar"/>
+        </w:rPr>
+        <w:t xml:space="preserve">9e7d9b96c2306237b8c1ff8ee4094c03761b835f183f6519b3a7567f7c4bcd02</w:t>
+      </w:r>
+    </w:p>
+    <w:p>
+      <w:pPr>
+        <w:pStyle w:val="Compact"/>
+        <w:numPr>
+          <w:ilvl w:val="0"/>
+          <w:numId w:val="1016"/>
+        </w:numPr>
+      </w:pPr>
+      <w:r>
+        <w:rPr>
+          <w:b/>
+          <w:bCs/>
+        </w:rPr>
+        <w:t xml:space="preserve">USDT 测试代币地址</w:t>
+      </w:r>
+      <w:r>
+        <w:t xml:space="preserve">：</w:t>
+      </w:r>
+      <w:r>
+        <w:rPr>
+          <w:rStyle w:val="VerbatimChar"/>
+        </w:rPr>
+        <w:t xml:space="preserve">0x26dd16D5B9708032872a7cD10C100b0FcE4E79a9</w:t>
+      </w:r>
+    </w:p>
+    <w:bookmarkStart w:id="54" w:name="推荐关系测试地址"/>
+    <w:p>
+      <w:pPr>
+        <w:pStyle w:val="Heading3"/>
+      </w:pPr>
+      <w:r>
+        <w:t xml:space="preserve">推荐关系测试地址</w:t>
+      </w:r>
+    </w:p>
+    <w:p>
+      <w:pPr>
+        <w:pStyle w:val="Compact"/>
+        <w:numPr>
+          <w:ilvl w:val="0"/>
+          <w:numId w:val="1017"/>
+        </w:numPr>
+      </w:pPr>
+      <w:r>
+        <w:rPr>
+          <w:b/>
+          <w:bCs/>
+        </w:rPr>
+        <w:t xml:space="preserve">买票人</w:t>
+      </w:r>
+      <w:r>
+        <w:t xml:space="preserve">：</w:t>
+      </w:r>
+      <w:r>
+        <w:rPr>
+          <w:rStyle w:val="VerbatimChar"/>
+        </w:rPr>
+        <w:t xml:space="preserve">0x122e268a49b3b617af62be87393b214894c7a674</w:t>
+      </w:r>
+      <w:r>
+        <w:br/>
+      </w:r>
+      <w:r>
+        <w:rPr>
+          <w:b/>
+          <w:bCs/>
+        </w:rPr>
+        <w:t xml:space="preserve">私钥</w:t>
+      </w:r>
+      <w:r>
+        <w:t xml:space="preserve">：</w:t>
+      </w:r>
+      <w:r>
+        <w:rPr>
+          <w:rStyle w:val="VerbatimChar"/>
+        </w:rPr>
+        <w:t xml:space="preserve">89cc918e6bdb4c46c49c8a3c5f2807f98f55109fa64d088fcbdef6099a47a89a</w:t>
+      </w:r>
+    </w:p>
+    <w:p>
+      <w:pPr>
+        <w:pStyle w:val="Compact"/>
+        <w:numPr>
+          <w:ilvl w:val="0"/>
+          <w:numId w:val="1017"/>
+        </w:numPr>
+      </w:pPr>
+      <w:r>
+        <w:rPr>
+          <w:b/>
+          <w:bCs/>
+        </w:rPr>
+        <w:t xml:space="preserve">邀请人（直推）</w:t>
+      </w:r>
+      <w:r>
+        <w:t xml:space="preserve">：</w:t>
+      </w:r>
+      <w:r>
+        <w:rPr>
+          <w:rStyle w:val="VerbatimChar"/>
+        </w:rPr>
+        <w:t xml:space="preserve">0x2cf5446b1d01fbf0be6e895f1c26b2a6a40ad3d7</w:t>
+      </w:r>
+      <w:r>
+        <w:br/>
+      </w:r>
+      <w:r>
+        <w:rPr>
+          <w:b/>
+          <w:bCs/>
+        </w:rPr>
+        <w:t xml:space="preserve">私钥</w:t>
+      </w:r>
+      <w:r>
+        <w:t xml:space="preserve">：</w:t>
+      </w:r>
+      <w:r>
+        <w:rPr>
+          <w:rStyle w:val="VerbatimChar"/>
+        </w:rPr>
+        <w:t xml:space="preserve">113f848e2c433dcefd7bd62227fcda34269e12f138ebf430189277a63ecbdacb</w:t>
+      </w:r>
+    </w:p>
+    <w:p>
+      <w:pPr>
+        <w:pStyle w:val="Compact"/>
+        <w:numPr>
+          <w:ilvl w:val="0"/>
+          <w:numId w:val="1017"/>
+        </w:numPr>
+      </w:pPr>
+      <w:r>
+        <w:rPr>
+          <w:b/>
+          <w:bCs/>
+        </w:rPr>
+        <w:t xml:space="preserve">间接邀请人</w:t>
+      </w:r>
+      <w:r>
+        <w:t xml:space="preserve">：</w:t>
+      </w:r>
+      <w:r>
+        <w:rPr>
+          <w:rStyle w:val="VerbatimChar"/>
+        </w:rPr>
+        <w:t xml:space="preserve">0xb8ee25e6f4e993406180fe9fdfca0c935605a39c</w:t>
+      </w:r>
+      <w:r>
+        <w:br/>
+      </w:r>
+      <w:r>
+        <w:rPr>
+          <w:b/>
+          <w:bCs/>
+        </w:rPr>
+        <w:t xml:space="preserve">私钥</w:t>
+      </w:r>
+      <w:r>
+        <w:t xml:space="preserve">：</w:t>
+      </w:r>
+      <w:r>
+        <w:rPr>
+          <w:rStyle w:val="VerbatimChar"/>
+        </w:rPr>
+        <w:t xml:space="preserve">fa3cdf14159a270ca6da44567b3d99dfcbe007f42b8bceab62e01110fc57ba84</w:t>
+      </w:r>
+    </w:p>
     <w:bookmarkEnd w:id="54"/>
+    <w:bookmarkStart w:id="55" w:name="管理员预置空投地址"/>
+    <w:p>
+      <w:pPr>
+        <w:pStyle w:val="Heading3"/>
+      </w:pPr>
+      <w:r>
+        <w:t xml:space="preserve">管理员预置空投地址</w:t>
+      </w:r>
+    </w:p>
+    <w:p>
+      <w:pPr>
+        <w:pStyle w:val="Compact"/>
+        <w:numPr>
+          <w:ilvl w:val="0"/>
+          <w:numId w:val="1018"/>
+        </w:numPr>
+      </w:pPr>
+      <w:r>
+        <w:rPr>
+          <w:rStyle w:val="VerbatimChar"/>
+        </w:rPr>
+        <w:t xml:space="preserve">0x9e77389505ccd3d89e11109b3ec96d8458603ffe</w:t>
+      </w:r>
+      <w:r>
+        <w:br/>
+      </w:r>
+      <w:r>
+        <w:rPr>
+          <w:b/>
+          <w:bCs/>
+        </w:rPr>
+        <w:t xml:space="preserve">私钥</w:t>
+      </w:r>
+      <w:r>
+        <w:t xml:space="preserve">：</w:t>
+      </w:r>
+      <w:r>
+        <w:rPr>
+          <w:rStyle w:val="VerbatimChar"/>
+        </w:rPr>
+        <w:t xml:space="preserve">418fd094258cd4f17e8ad197fe07e15321c3f07deac1b59cea98cf6342ae4549</w:t>
+      </w:r>
+    </w:p>
+    <w:p>
+      <w:pPr>
+        <w:pStyle w:val="Compact"/>
+        <w:numPr>
+          <w:ilvl w:val="0"/>
+          <w:numId w:val="1018"/>
+        </w:numPr>
+      </w:pPr>
+      <w:r>
+        <w:rPr>
+          <w:rStyle w:val="VerbatimChar"/>
+        </w:rPr>
+        <w:t xml:space="preserve">0xdf122a018c12d6129205f98a8c8758f4f2ff37c3</w:t>
+      </w:r>
+      <w:r>
+        <w:br/>
+      </w:r>
+      <w:r>
+        <w:rPr>
+          <w:b/>
+          <w:bCs/>
+        </w:rPr>
+        <w:t xml:space="preserve">私钥</w:t>
+      </w:r>
+      <w:r>
+        <w:t xml:space="preserve">：</w:t>
+      </w:r>
+      <w:r>
+        <w:rPr>
+          <w:rStyle w:val="VerbatimChar"/>
+        </w:rPr>
+        <w:t xml:space="preserve">1fe977553945e7a7d960654020cb8b378229bf42607ad174616732ba04886533</w:t>
+      </w:r>
+    </w:p>
+    <w:p>
+      <w:pPr>
+        <w:pStyle w:val="Compact"/>
+        <w:numPr>
+          <w:ilvl w:val="0"/>
+          <w:numId w:val="1018"/>
+        </w:numPr>
+      </w:pPr>
+      <w:r>
+        <w:rPr>
+          <w:rStyle w:val="VerbatimChar"/>
+        </w:rPr>
+        <w:t xml:space="preserve">0x02b6438f76d32d6195f25e122af0a71d9067f9f8</w:t>
+      </w:r>
+      <w:r>
+        <w:br/>
+      </w:r>
+      <w:r>
+        <w:rPr>
+          <w:b/>
+          <w:bCs/>
+        </w:rPr>
+        <w:t xml:space="preserve">私钥</w:t>
+      </w:r>
+      <w:r>
+        <w:t xml:space="preserve">：</w:t>
+      </w:r>
+      <w:r>
+        <w:rPr>
+          <w:rStyle w:val="VerbatimChar"/>
+        </w:rPr>
+        <w:t xml:space="preserve">93bc67ddaea266c3fcba97d2fd146972d8f60d52d5e4cc0d0e7cdb5604cab442</w:t>
+      </w:r>
+    </w:p>
+    <w:bookmarkEnd w:id="55"/>
+    <w:bookmarkEnd w:id="56"/>
+    <w:bookmarkEnd w:id="57"/>
     <w:sectPr/>
   </w:body>
 </w:document>
@@ -1842,6 +2112,42 @@
     </w:lvlOverride>
   </w:num>
   <w:num w:numId="1015">
+    <w:abstractNumId w:val="99411"/>
+    <w:lvlOverride w:ilvl="0">
+      <w:startOverride w:val="1"/>
+    </w:lvlOverride>
+    <w:lvlOverride w:ilvl="1">
+      <w:startOverride w:val="1"/>
+    </w:lvlOverride>
+    <w:lvlOverride w:ilvl="2">
+      <w:startOverride w:val="1"/>
+    </w:lvlOverride>
+    <w:lvlOverride w:ilvl="3">
+      <w:startOverride w:val="1"/>
+    </w:lvlOverride>
+    <w:lvlOverride w:ilvl="4">
+      <w:startOverride w:val="1"/>
+    </w:lvlOverride>
+    <w:lvlOverride w:ilvl="5">
+      <w:startOverride w:val="1"/>
+    </w:lvlOverride>
+    <w:lvlOverride w:ilvl="6">
+      <w:startOverride w:val="1"/>
+    </w:lvlOverride>
+    <w:lvlOverride w:ilvl="7">
+      <w:startOverride w:val="1"/>
+    </w:lvlOverride>
+    <w:lvlOverride w:ilvl="8">
+      <w:startOverride w:val="1"/>
+    </w:lvlOverride>
+  </w:num>
+  <w:num w:numId="1016">
+    <w:abstractNumId w:val="991"/>
+  </w:num>
+  <w:num w:numId="1017">
+    <w:abstractNumId w:val="991"/>
+  </w:num>
+  <w:num w:numId="1018">
     <w:abstractNumId w:val="99411"/>
     <w:lvlOverride w:ilvl="0">
       <w:startOverride w:val="1"/>

</xml_diff>

<commit_message>
docs: reorder testnet setup and update docx
</commit_message>
<xml_diff>
--- a/docs/thePlayer/tests/thePlayer-guide.docx
+++ b/docs/thePlayer/tests/thePlayer-guide.docx
@@ -55,13 +55,13 @@
         <w:t xml:space="preserve">玩家流程</w:t>
       </w:r>
     </w:p>
-    <w:bookmarkStart w:id="20" w:name="连接钱包"/>
+    <w:bookmarkStart w:id="23" w:name="添加-bsc-测试网链配置"/>
     <w:p>
       <w:pPr>
         <w:pStyle w:val="Heading3"/>
       </w:pPr>
       <w:r>
-        <w:t xml:space="preserve">1. 连接钱包</w:t>
+        <w:t xml:space="preserve">1. 添加 BSC 测试网（链配置）</w:t>
       </w:r>
     </w:p>
     <w:p>
@@ -73,7 +73,55 @@
         </w:numPr>
       </w:pPr>
       <w:r>
-        <w:t xml:space="preserve">打开玩家端，点击右上角「连接钱包」，选择 BSC 测试网（或正式部署后的主网）。</w:t>
+        <w:t xml:space="preserve">推荐用 Chainlist 自动添加：https://chainlist.org/ 搜索</w:t>
+      </w:r>
+      <w:r>
+        <w:t xml:space="preserve"> </w:t>
+      </w:r>
+      <w:r>
+        <w:t xml:space="preserve">“</w:t>
+      </w:r>
+      <w:r>
+        <w:t xml:space="preserve">BSC Testnet</w:t>
+      </w:r>
+      <w:r>
+        <w:t xml:space="preserve">”</w:t>
+      </w:r>
+      <w:r>
+        <w:t xml:space="preserve">，点击</w:t>
+      </w:r>
+      <w:r>
+        <w:t xml:space="preserve"> </w:t>
+      </w:r>
+      <w:r>
+        <w:t xml:space="preserve">“</w:t>
+      </w:r>
+      <w:r>
+        <w:t xml:space="preserve">Connect Wallet</w:t>
+      </w:r>
+      <w:r>
+        <w:t xml:space="preserve">”</w:t>
+      </w:r>
+      <w:r>
+        <w:t xml:space="preserve"> </w:t>
+      </w:r>
+      <w:r>
+        <w:t xml:space="preserve">再</w:t>
+      </w:r>
+      <w:r>
+        <w:t xml:space="preserve"> </w:t>
+      </w:r>
+      <w:r>
+        <w:t xml:space="preserve">“</w:t>
+      </w:r>
+      <w:r>
+        <w:t xml:space="preserve">Add to Wallet</w:t>
+      </w:r>
+      <w:r>
+        <w:t xml:space="preserve">”</w:t>
+      </w:r>
+      <w:r>
+        <w:t xml:space="preserve">，在钱包里确认即可。</w:t>
       </w:r>
     </w:p>
     <w:p>
@@ -85,118 +133,67 @@
         </w:numPr>
       </w:pPr>
       <w:r>
-        <w:t xml:space="preserve">成功连接后，界面会显示当前账号缩写。</w:t>
-      </w:r>
-    </w:p>
-    <w:bookmarkEnd w:id="20"/>
-    <w:bookmarkStart w:id="24" w:name="购票步骤"/>
-    <w:p>
-      <w:pPr>
-        <w:pStyle w:val="Heading3"/>
-      </w:pPr>
-      <w:r>
-        <w:t xml:space="preserve">2. 购票步骤</w:t>
-      </w:r>
-    </w:p>
-    <w:p>
-      <w:pPr>
-        <w:pStyle w:val="Compact"/>
-        <w:numPr>
-          <w:ilvl w:val="0"/>
+        <w:t xml:space="preserve">若手动添加，可在钱包里新增网络并填入：</w:t>
+      </w:r>
+    </w:p>
+    <w:p>
+      <w:pPr>
+        <w:pStyle w:val="Compact"/>
+        <w:numPr>
+          <w:ilvl w:val="1"/>
           <w:numId w:val="1002"/>
         </w:numPr>
       </w:pPr>
       <w:r>
-        <w:t xml:space="preserve">在「购票中心」选择 1/10/100/1000 张；如有推荐人，在「推荐人地址」填入上级地址（示例：</w:t>
-      </w:r>
-      <w:r>
-        <w:rPr>
-          <w:rStyle w:val="VerbatimChar"/>
-        </w:rPr>
-        <w:t xml:space="preserve">0x2cf5⋯</w:t>
-      </w:r>
-      <w:r>
-        <w:t xml:space="preserve">）。</w:t>
-      </w:r>
-    </w:p>
-    <w:p>
-      <w:pPr>
-        <w:pStyle w:val="Compact"/>
-        <w:numPr>
-          <w:ilvl w:val="0"/>
+        <w:t xml:space="preserve">网络名称：BSC Testnet</w:t>
+      </w:r>
+    </w:p>
+    <w:p>
+      <w:pPr>
+        <w:pStyle w:val="Compact"/>
+        <w:numPr>
+          <w:ilvl w:val="1"/>
           <w:numId w:val="1002"/>
         </w:numPr>
       </w:pPr>
       <w:r>
-        <w:t xml:space="preserve">确保本次购票金额 ≥ 空投门槛（默认 1 USDT），否则不会增加抽奖概率。</w:t>
-      </w:r>
-    </w:p>
-    <w:p>
-      <w:pPr>
-        <w:pStyle w:val="Compact"/>
-        <w:numPr>
-          <w:ilvl w:val="0"/>
+        <w:t xml:space="preserve">新 RPC URL：https://data-seed-prebsc-1-s1.binance.org:8545</w:t>
+      </w:r>
+    </w:p>
+    <w:p>
+      <w:pPr>
+        <w:pStyle w:val="Compact"/>
+        <w:numPr>
+          <w:ilvl w:val="1"/>
           <w:numId w:val="1002"/>
         </w:numPr>
       </w:pPr>
       <w:r>
-        <w:t xml:space="preserve">若担心票价浮动，在「最大可接受成本」输入上限。</w:t>
-      </w:r>
-    </w:p>
-    <w:p>
-      <w:pPr>
-        <w:pStyle w:val="Compact"/>
-        <w:numPr>
-          <w:ilvl w:val="0"/>
+        <w:t xml:space="preserve">链 ID：97</w:t>
+      </w:r>
+    </w:p>
+    <w:p>
+      <w:pPr>
+        <w:pStyle w:val="Compact"/>
+        <w:numPr>
+          <w:ilvl w:val="1"/>
           <w:numId w:val="1002"/>
         </w:numPr>
       </w:pPr>
       <w:r>
-        <w:t xml:space="preserve">点击购票按钮，钱包弹窗确认即可；系统会自动结算分红、推广、空投。</w:t>
-      </w:r>
-    </w:p>
-    <w:p>
-      <w:pPr>
-        <w:pStyle w:val="BlockText"/>
-      </w:pPr>
-      <w:r>
-        <w:t xml:space="preserve">示例推荐关系：</w:t>
-      </w:r>
-      <w:r>
-        <w:br/>
-      </w:r>
-      <w:r>
-        <w:t xml:space="preserve">买票人：</w:t>
-      </w:r>
-      <w:r>
-        <w:rPr>
-          <w:rStyle w:val="VerbatimChar"/>
-        </w:rPr>
-        <w:t xml:space="preserve">0x122e268a49b3b617af62be87393b214894c7a674</w:t>
-      </w:r>
-      <w:r>
-        <w:br/>
-      </w:r>
-      <w:r>
-        <w:t xml:space="preserve">直推：</w:t>
-      </w:r>
-      <w:r>
-        <w:rPr>
-          <w:rStyle w:val="VerbatimChar"/>
-        </w:rPr>
-        <w:t xml:space="preserve">0x2cf5446b1d01fbf0be6e895f1c26b2a6a40ad3d7</w:t>
-      </w:r>
-      <w:r>
-        <w:br/>
-      </w:r>
-      <w:r>
-        <w:t xml:space="preserve">间推：</w:t>
-      </w:r>
-      <w:r>
-        <w:rPr>
-          <w:rStyle w:val="VerbatimChar"/>
-        </w:rPr>
-        <w:t xml:space="preserve">0xb8ee25e6f4e993406180fe9fdfca0c935605a39c</w:t>
+        <w:t xml:space="preserve">货币符号：tBNB</w:t>
+      </w:r>
+    </w:p>
+    <w:p>
+      <w:pPr>
+        <w:pStyle w:val="Compact"/>
+        <w:numPr>
+          <w:ilvl w:val="1"/>
+          <w:numId w:val="1002"/>
+        </w:numPr>
+      </w:pPr>
+      <w:r>
+        <w:t xml:space="preserve">浏览器：https://testnet.bscscan.com</w:t>
       </w:r>
     </w:p>
     <w:p>
@@ -204,28 +201,28 @@
         <w:pStyle w:val="FirstParagraph"/>
       </w:pPr>
       <w:r>
-        <w:t xml:space="preserve">页面示例：</w:t>
-      </w:r>
-      <w:r>
-        <w:br/>
+        <w:t xml:space="preserve">示例截图：</w:t>
+      </w:r>
+      <w:r>
+        <w:t xml:space="preserve"> </w:t>
       </w:r>
       <w:r>
         <w:drawing>
           <wp:inline>
             <wp:extent cx="5334000" cy="11559778"/>
             <wp:effectExtent b="0" l="0" r="0" t="0"/>
-            <wp:docPr descr="购票界面" title="" id="22" name="Picture"/>
+            <wp:docPr descr="测试网添加" title="" id="21" name="Picture"/>
             <a:graphic>
               <a:graphicData uri="http://schemas.openxmlformats.org/drawingml/2006/picture">
                 <pic:pic>
                   <pic:nvPicPr>
-                    <pic:cNvPr descr="pic/购买门票1.png" id="23" name="Picture"/>
+                    <pic:cNvPr descr="pic/测试网添加.png" id="22" name="Picture"/>
                     <pic:cNvPicPr>
                       <a:picLocks noChangeArrowheads="1" noChangeAspect="1"/>
                     </pic:cNvPicPr>
                   </pic:nvPicPr>
                   <pic:blipFill>
-                    <a:blip r:embed="rId21"/>
+                    <a:blip r:embed="rId20"/>
                     <a:stretch>
                       <a:fillRect/>
                     </a:stretch>
@@ -252,143 +249,149 @@
         </w:drawing>
       </w:r>
     </w:p>
+    <w:bookmarkEnd w:id="23"/>
+    <w:bookmarkStart w:id="24" w:name="连接钱包"/>
+    <w:p>
+      <w:pPr>
+        <w:pStyle w:val="Heading3"/>
+      </w:pPr>
+      <w:r>
+        <w:t xml:space="preserve">2. 连接钱包</w:t>
+      </w:r>
+    </w:p>
+    <w:p>
+      <w:pPr>
+        <w:pStyle w:val="Compact"/>
+        <w:numPr>
+          <w:ilvl w:val="0"/>
+          <w:numId w:val="1003"/>
+        </w:numPr>
+      </w:pPr>
+      <w:r>
+        <w:t xml:space="preserve">打开玩家端，点击右上角「连接钱包」，选择 BSC 测试网（或正式部署后的主网）。</w:t>
+      </w:r>
+    </w:p>
+    <w:p>
+      <w:pPr>
+        <w:pStyle w:val="Compact"/>
+        <w:numPr>
+          <w:ilvl w:val="0"/>
+          <w:numId w:val="1003"/>
+        </w:numPr>
+      </w:pPr>
+      <w:r>
+        <w:t xml:space="preserve">成功连接后，界面会显示当前账号缩写。</w:t>
+      </w:r>
+    </w:p>
     <w:bookmarkEnd w:id="24"/>
-    <w:bookmarkStart w:id="31" w:name="收益查看"/>
+    <w:bookmarkStart w:id="28" w:name="购票步骤"/>
     <w:p>
       <w:pPr>
         <w:pStyle w:val="Heading3"/>
       </w:pPr>
       <w:r>
-        <w:t xml:space="preserve">3. 收益查看</w:t>
-      </w:r>
-    </w:p>
-    <w:p>
-      <w:pPr>
-        <w:pStyle w:val="Compact"/>
-        <w:numPr>
-          <w:ilvl w:val="0"/>
-          <w:numId w:val="1003"/>
-        </w:numPr>
-      </w:pPr>
-      <w:r>
-        <w:t xml:space="preserve">「收益面板」显示三项：</w:t>
-      </w:r>
-    </w:p>
-    <w:p>
-      <w:pPr>
-        <w:pStyle w:val="Compact"/>
-        <w:numPr>
-          <w:ilvl w:val="1"/>
+        <w:t xml:space="preserve">3. 购票步骤</w:t>
+      </w:r>
+    </w:p>
+    <w:p>
+      <w:pPr>
+        <w:pStyle w:val="Compact"/>
+        <w:numPr>
+          <w:ilvl w:val="0"/>
           <w:numId w:val="1004"/>
         </w:numPr>
       </w:pPr>
       <w:r>
-        <w:rPr>
-          <w:b/>
-          <w:bCs/>
-        </w:rPr>
-        <w:t xml:space="preserve">总收益</w:t>
-      </w:r>
-      <w:r>
-        <w:t xml:space="preserve">：当前可提的 USDT。</w:t>
+        <w:t xml:space="preserve">在「购票中心」选择 1/10/100/1000 张；如有推荐人，在「推荐人地址」填入上级地址（示例：</w:t>
+      </w:r>
+      <w:r>
+        <w:rPr>
+          <w:rStyle w:val="VerbatimChar"/>
+        </w:rPr>
+        <w:t xml:space="preserve">0x2cf5⋯</w:t>
+      </w:r>
+      <w:r>
+        <w:t xml:space="preserve">）。</w:t>
+      </w:r>
+    </w:p>
+    <w:p>
+      <w:pPr>
+        <w:pStyle w:val="Compact"/>
+        <w:numPr>
+          <w:ilvl w:val="0"/>
+          <w:numId w:val="1004"/>
+        </w:numPr>
+      </w:pPr>
+      <w:r>
+        <w:t xml:space="preserve">确保本次购票金额 ≥ 空投门槛（默认 1 USDT），否则不会增加抽奖概率。</w:t>
+      </w:r>
+    </w:p>
+    <w:p>
+      <w:pPr>
+        <w:pStyle w:val="Compact"/>
+        <w:numPr>
+          <w:ilvl w:val="0"/>
+          <w:numId w:val="1004"/>
+        </w:numPr>
+      </w:pPr>
+      <w:r>
+        <w:t xml:space="preserve">若担心票价浮动，在「最大可接受成本」输入上限。</w:t>
+      </w:r>
+    </w:p>
+    <w:p>
+      <w:pPr>
+        <w:pStyle w:val="Compact"/>
+        <w:numPr>
+          <w:ilvl w:val="0"/>
+          <w:numId w:val="1004"/>
+        </w:numPr>
+      </w:pPr>
+      <w:r>
+        <w:t xml:space="preserve">点击购票按钮，钱包弹窗确认即可；系统会自动结算分红、推广、空投。</w:t>
+      </w:r>
+    </w:p>
+    <w:p>
+      <w:pPr>
+        <w:pStyle w:val="BlockText"/>
+      </w:pPr>
+      <w:r>
+        <w:t xml:space="preserve">示例推荐关系：</w:t>
       </w:r>
       <w:r>
         <w:br/>
       </w:r>
-    </w:p>
-    <w:p>
-      <w:pPr>
-        <w:pStyle w:val="Compact"/>
-        <w:numPr>
-          <w:ilvl w:val="1"/>
-          <w:numId w:val="1004"/>
-        </w:numPr>
-      </w:pPr>
-      <w:r>
-        <w:rPr>
-          <w:b/>
-          <w:bCs/>
-        </w:rPr>
-        <w:t xml:space="preserve">分红收益</w:t>
-      </w:r>
-      <w:r>
-        <w:t xml:space="preserve">：未结算分红，点「提现收益」即可累加到总收益。</w:t>
+      <w:r>
+        <w:t xml:space="preserve">买票人：</w:t>
+      </w:r>
+      <w:r>
+        <w:rPr>
+          <w:rStyle w:val="VerbatimChar"/>
+        </w:rPr>
+        <w:t xml:space="preserve">0x122e268a49b3b617af62be87393b214894c7a674</w:t>
       </w:r>
       <w:r>
         <w:br/>
       </w:r>
-    </w:p>
-    <w:p>
-      <w:pPr>
-        <w:pStyle w:val="Compact"/>
-        <w:numPr>
-          <w:ilvl w:val="1"/>
-          <w:numId w:val="1004"/>
-        </w:numPr>
-      </w:pPr>
-      <w:r>
-        <w:rPr>
-          <w:b/>
-          <w:bCs/>
-        </w:rPr>
-        <w:t xml:space="preserve">推广收益</w:t>
-      </w:r>
-      <w:r>
-        <w:t xml:space="preserve">：直推/间推累计金额。</w:t>
-      </w:r>
-    </w:p>
-    <w:p>
-      <w:pPr>
-        <w:pStyle w:val="Compact"/>
-        <w:numPr>
-          <w:ilvl w:val="0"/>
-          <w:numId w:val="1003"/>
-        </w:numPr>
-      </w:pPr>
-      <w:r>
-        <w:t xml:space="preserve">「我的钱包」卡片提供快速提现：</w:t>
-      </w:r>
-    </w:p>
-    <w:p>
-      <w:pPr>
-        <w:pStyle w:val="Compact"/>
-        <w:numPr>
-          <w:ilvl w:val="1"/>
-          <w:numId w:val="1005"/>
-        </w:numPr>
-      </w:pPr>
-      <w:r>
-        <w:t xml:space="preserve">点击「提现 USDT」即可把总收益转回钱包。</w:t>
+      <w:r>
+        <w:t xml:space="preserve">直推：</w:t>
+      </w:r>
+      <w:r>
+        <w:rPr>
+          <w:rStyle w:val="VerbatimChar"/>
+        </w:rPr>
+        <w:t xml:space="preserve">0x2cf5446b1d01fbf0be6e895f1c26b2a6a40ad3d7</w:t>
       </w:r>
       <w:r>
         <w:br/>
       </w:r>
-    </w:p>
-    <w:p>
-      <w:pPr>
-        <w:pStyle w:val="Compact"/>
-        <w:numPr>
-          <w:ilvl w:val="1"/>
-          <w:numId w:val="1005"/>
-        </w:numPr>
-      </w:pPr>
-      <w:r>
-        <w:t xml:space="preserve">若有空投奖励，点「提取空投奖励」领取。</w:t>
-      </w:r>
-      <w:r>
-        <w:br/>
-      </w:r>
-    </w:p>
-    <w:p>
-      <w:pPr>
-        <w:pStyle w:val="Compact"/>
-        <w:numPr>
-          <w:ilvl w:val="1"/>
-          <w:numId w:val="1005"/>
-        </w:numPr>
-      </w:pPr>
-      <w:r>
-        <w:t xml:space="preserve">「下一轮提示」会显示回合状态，如果显示“当前轮已结束”，请等待管理员结算并开启新一轮。</w:t>
+      <w:r>
+        <w:t xml:space="preserve">间推：</w:t>
+      </w:r>
+      <w:r>
+        <w:rPr>
+          <w:rStyle w:val="VerbatimChar"/>
+        </w:rPr>
+        <w:t xml:space="preserve">0xb8ee25e6f4e993406180fe9fdfca0c935605a39c</w:t>
       </w:r>
     </w:p>
     <w:p>
@@ -396,7 +399,7 @@
         <w:pStyle w:val="FirstParagraph"/>
       </w:pPr>
       <w:r>
-        <w:t xml:space="preserve">界面示例：</w:t>
+        <w:t xml:space="preserve">页面示例：</w:t>
       </w:r>
       <w:r>
         <w:br/>
@@ -406,12 +409,12 @@
           <wp:inline>
             <wp:extent cx="5334000" cy="11559778"/>
             <wp:effectExtent b="0" l="0" r="0" t="0"/>
-            <wp:docPr descr="收益面板" title="" id="26" name="Picture"/>
+            <wp:docPr descr="购票界面" title="" id="26" name="Picture"/>
             <a:graphic>
               <a:graphicData uri="http://schemas.openxmlformats.org/drawingml/2006/picture">
                 <pic:pic>
                   <pic:nvPicPr>
-                    <pic:cNvPr descr="pic/查看收益.jpg" id="27" name="Picture"/>
+                    <pic:cNvPr descr="pic/购买门票1.png" id="27" name="Picture"/>
                     <pic:cNvPicPr>
                       <a:picLocks noChangeArrowheads="1" noChangeAspect="1"/>
                     </pic:cNvPicPr>
@@ -443,6 +446,153 @@
           </wp:inline>
         </w:drawing>
       </w:r>
+    </w:p>
+    <w:bookmarkEnd w:id="28"/>
+    <w:bookmarkStart w:id="35" w:name="收益查看"/>
+    <w:p>
+      <w:pPr>
+        <w:pStyle w:val="Heading3"/>
+      </w:pPr>
+      <w:r>
+        <w:t xml:space="preserve">3. 收益查看</w:t>
+      </w:r>
+    </w:p>
+    <w:p>
+      <w:pPr>
+        <w:pStyle w:val="Compact"/>
+        <w:numPr>
+          <w:ilvl w:val="0"/>
+          <w:numId w:val="1005"/>
+        </w:numPr>
+      </w:pPr>
+      <w:r>
+        <w:t xml:space="preserve">「收益面板」显示三项：</w:t>
+      </w:r>
+    </w:p>
+    <w:p>
+      <w:pPr>
+        <w:pStyle w:val="Compact"/>
+        <w:numPr>
+          <w:ilvl w:val="1"/>
+          <w:numId w:val="1006"/>
+        </w:numPr>
+      </w:pPr>
+      <w:r>
+        <w:rPr>
+          <w:b/>
+          <w:bCs/>
+        </w:rPr>
+        <w:t xml:space="preserve">总收益</w:t>
+      </w:r>
+      <w:r>
+        <w:t xml:space="preserve">：当前可提的 USDT。</w:t>
+      </w:r>
+      <w:r>
+        <w:br/>
+      </w:r>
+    </w:p>
+    <w:p>
+      <w:pPr>
+        <w:pStyle w:val="Compact"/>
+        <w:numPr>
+          <w:ilvl w:val="1"/>
+          <w:numId w:val="1006"/>
+        </w:numPr>
+      </w:pPr>
+      <w:r>
+        <w:rPr>
+          <w:b/>
+          <w:bCs/>
+        </w:rPr>
+        <w:t xml:space="preserve">分红收益</w:t>
+      </w:r>
+      <w:r>
+        <w:t xml:space="preserve">：未结算分红，点「提现收益」即可累加到总收益。</w:t>
+      </w:r>
+      <w:r>
+        <w:br/>
+      </w:r>
+    </w:p>
+    <w:p>
+      <w:pPr>
+        <w:pStyle w:val="Compact"/>
+        <w:numPr>
+          <w:ilvl w:val="1"/>
+          <w:numId w:val="1006"/>
+        </w:numPr>
+      </w:pPr>
+      <w:r>
+        <w:rPr>
+          <w:b/>
+          <w:bCs/>
+        </w:rPr>
+        <w:t xml:space="preserve">推广收益</w:t>
+      </w:r>
+      <w:r>
+        <w:t xml:space="preserve">：直推/间推累计金额。</w:t>
+      </w:r>
+    </w:p>
+    <w:p>
+      <w:pPr>
+        <w:pStyle w:val="Compact"/>
+        <w:numPr>
+          <w:ilvl w:val="0"/>
+          <w:numId w:val="1005"/>
+        </w:numPr>
+      </w:pPr>
+      <w:r>
+        <w:t xml:space="preserve">「我的钱包」卡片提供快速提现：</w:t>
+      </w:r>
+    </w:p>
+    <w:p>
+      <w:pPr>
+        <w:pStyle w:val="Compact"/>
+        <w:numPr>
+          <w:ilvl w:val="1"/>
+          <w:numId w:val="1007"/>
+        </w:numPr>
+      </w:pPr>
+      <w:r>
+        <w:t xml:space="preserve">点击「提现 USDT」即可把总收益转回钱包。</w:t>
+      </w:r>
+      <w:r>
+        <w:br/>
+      </w:r>
+    </w:p>
+    <w:p>
+      <w:pPr>
+        <w:pStyle w:val="Compact"/>
+        <w:numPr>
+          <w:ilvl w:val="1"/>
+          <w:numId w:val="1007"/>
+        </w:numPr>
+      </w:pPr>
+      <w:r>
+        <w:t xml:space="preserve">若有空投奖励，点「提取空投奖励」领取。</w:t>
+      </w:r>
+      <w:r>
+        <w:br/>
+      </w:r>
+    </w:p>
+    <w:p>
+      <w:pPr>
+        <w:pStyle w:val="Compact"/>
+        <w:numPr>
+          <w:ilvl w:val="1"/>
+          <w:numId w:val="1007"/>
+        </w:numPr>
+      </w:pPr>
+      <w:r>
+        <w:t xml:space="preserve">「下一轮提示」会显示回合状态，如果显示“当前轮已结束”，请等待管理员结算并开启新一轮。</w:t>
+      </w:r>
+    </w:p>
+    <w:p>
+      <w:pPr>
+        <w:pStyle w:val="FirstParagraph"/>
+      </w:pPr>
+      <w:r>
+        <w:t xml:space="preserve">界面示例：</w:t>
+      </w:r>
       <w:r>
         <w:br/>
       </w:r>
@@ -451,18 +601,18 @@
           <wp:inline>
             <wp:extent cx="5334000" cy="11559778"/>
             <wp:effectExtent b="0" l="0" r="0" t="0"/>
-            <wp:docPr descr="可提现资金与空投" title="" id="29" name="Picture"/>
+            <wp:docPr descr="收益面板" title="" id="30" name="Picture"/>
             <a:graphic>
               <a:graphicData uri="http://schemas.openxmlformats.org/drawingml/2006/picture">
                 <pic:pic>
                   <pic:nvPicPr>
-                    <pic:cNvPr descr="pic/可提现的资金和空投.jpg" id="30" name="Picture"/>
+                    <pic:cNvPr descr="pic/查看收益.jpg" id="31" name="Picture"/>
                     <pic:cNvPicPr>
                       <a:picLocks noChangeArrowheads="1" noChangeAspect="1"/>
                     </pic:cNvPicPr>
                   </pic:nvPicPr>
                   <pic:blipFill>
-                    <a:blip r:embed="rId28"/>
+                    <a:blip r:embed="rId29"/>
                     <a:stretch>
                       <a:fillRect/>
                     </a:stretch>
@@ -488,210 +638,26 @@
           </wp:inline>
         </w:drawing>
       </w:r>
-    </w:p>
-    <w:bookmarkEnd w:id="31"/>
-    <w:bookmarkStart w:id="32" w:name="空投信息"/>
-    <w:p>
-      <w:pPr>
-        <w:pStyle w:val="Heading3"/>
-      </w:pPr>
-      <w:r>
-        <w:t xml:space="preserve">4. 空投信息</w:t>
-      </w:r>
-    </w:p>
-    <w:p>
-      <w:pPr>
-        <w:pStyle w:val="Compact"/>
-        <w:numPr>
-          <w:ilvl w:val="0"/>
-          <w:numId w:val="1006"/>
-        </w:numPr>
-      </w:pPr>
-      <w:r>
-        <w:t xml:space="preserve">「空投挂单」会显示最近中奖者（地址 + 奖金 + 下一区块可领取），若显示“当前无挂单”说明还没人中奖或已结算。</w:t>
-      </w:r>
-    </w:p>
-    <w:p>
-      <w:pPr>
-        <w:pStyle w:val="Compact"/>
-        <w:numPr>
-          <w:ilvl w:val="0"/>
-          <w:numId w:val="1006"/>
-        </w:numPr>
-      </w:pPr>
-      <w:r>
-        <w:t xml:space="preserve">若中奖，需要等待至少 1 个区块，再点击「结算空投」或等待系统自动结算。</w:t>
-      </w:r>
-    </w:p>
-    <w:bookmarkEnd w:id="32"/>
-    <w:bookmarkStart w:id="36" w:name="添加-bsc-测试网链配置"/>
-    <w:p>
-      <w:pPr>
-        <w:pStyle w:val="Heading3"/>
-      </w:pPr>
-      <w:r>
-        <w:t xml:space="preserve">5. 添加 BSC 测试网（链配置）</w:t>
-      </w:r>
-    </w:p>
-    <w:p>
-      <w:pPr>
-        <w:pStyle w:val="Compact"/>
-        <w:numPr>
-          <w:ilvl w:val="0"/>
-          <w:numId w:val="1007"/>
-        </w:numPr>
-      </w:pPr>
-      <w:r>
-        <w:t xml:space="preserve">推荐用 Chainlist 自动添加：https://chainlist.org/ 搜索</w:t>
-      </w:r>
-      <w:r>
-        <w:t xml:space="preserve"> </w:t>
-      </w:r>
-      <w:r>
-        <w:t xml:space="preserve">“</w:t>
-      </w:r>
-      <w:r>
-        <w:t xml:space="preserve">BSC Testnet</w:t>
-      </w:r>
-      <w:r>
-        <w:t xml:space="preserve">”</w:t>
-      </w:r>
-      <w:r>
-        <w:t xml:space="preserve">，点击</w:t>
-      </w:r>
-      <w:r>
-        <w:t xml:space="preserve"> </w:t>
-      </w:r>
-      <w:r>
-        <w:t xml:space="preserve">“</w:t>
-      </w:r>
-      <w:r>
-        <w:t xml:space="preserve">Connect Wallet</w:t>
-      </w:r>
-      <w:r>
-        <w:t xml:space="preserve">”</w:t>
-      </w:r>
-      <w:r>
-        <w:t xml:space="preserve"> </w:t>
-      </w:r>
-      <w:r>
-        <w:t xml:space="preserve">再</w:t>
-      </w:r>
-      <w:r>
-        <w:t xml:space="preserve"> </w:t>
-      </w:r>
-      <w:r>
-        <w:t xml:space="preserve">“</w:t>
-      </w:r>
-      <w:r>
-        <w:t xml:space="preserve">Add to Wallet</w:t>
-      </w:r>
-      <w:r>
-        <w:t xml:space="preserve">”</w:t>
-      </w:r>
-      <w:r>
-        <w:t xml:space="preserve">，在钱包里确认即可。</w:t>
-      </w:r>
-    </w:p>
-    <w:p>
-      <w:pPr>
-        <w:pStyle w:val="Compact"/>
-        <w:numPr>
-          <w:ilvl w:val="0"/>
-          <w:numId w:val="1007"/>
-        </w:numPr>
-      </w:pPr>
-      <w:r>
-        <w:t xml:space="preserve">若手动添加，可在钱包里新增网络并填入：</w:t>
-      </w:r>
-    </w:p>
-    <w:p>
-      <w:pPr>
-        <w:pStyle w:val="Compact"/>
-        <w:numPr>
-          <w:ilvl w:val="1"/>
-          <w:numId w:val="1008"/>
-        </w:numPr>
-      </w:pPr>
-      <w:r>
-        <w:t xml:space="preserve">网络名称：BSC Testnet</w:t>
-      </w:r>
-    </w:p>
-    <w:p>
-      <w:pPr>
-        <w:pStyle w:val="Compact"/>
-        <w:numPr>
-          <w:ilvl w:val="1"/>
-          <w:numId w:val="1008"/>
-        </w:numPr>
-      </w:pPr>
-      <w:r>
-        <w:t xml:space="preserve">新 RPC URL：https://data-seed-prebsc-1-s1.binance.org:8545</w:t>
-      </w:r>
-    </w:p>
-    <w:p>
-      <w:pPr>
-        <w:pStyle w:val="Compact"/>
-        <w:numPr>
-          <w:ilvl w:val="1"/>
-          <w:numId w:val="1008"/>
-        </w:numPr>
-      </w:pPr>
-      <w:r>
-        <w:t xml:space="preserve">链 ID：97</w:t>
-      </w:r>
-    </w:p>
-    <w:p>
-      <w:pPr>
-        <w:pStyle w:val="Compact"/>
-        <w:numPr>
-          <w:ilvl w:val="1"/>
-          <w:numId w:val="1008"/>
-        </w:numPr>
-      </w:pPr>
-      <w:r>
-        <w:t xml:space="preserve">货币符号：tBNB</w:t>
-      </w:r>
-    </w:p>
-    <w:p>
-      <w:pPr>
-        <w:pStyle w:val="Compact"/>
-        <w:numPr>
-          <w:ilvl w:val="1"/>
-          <w:numId w:val="1008"/>
-        </w:numPr>
-      </w:pPr>
-      <w:r>
-        <w:t xml:space="preserve">浏览器：https://testnet.bscscan.com</w:t>
-      </w:r>
-    </w:p>
-    <w:p>
-      <w:pPr>
-        <w:pStyle w:val="FirstParagraph"/>
-      </w:pPr>
-      <w:r>
-        <w:t xml:space="preserve">示例截图：</w:t>
-      </w:r>
-      <w:r>
-        <w:t xml:space="preserve"> </w:t>
+      <w:r>
+        <w:br/>
       </w:r>
       <w:r>
         <w:drawing>
           <wp:inline>
             <wp:extent cx="5334000" cy="11559778"/>
             <wp:effectExtent b="0" l="0" r="0" t="0"/>
-            <wp:docPr descr="测试网添加" title="" id="34" name="Picture"/>
+            <wp:docPr descr="可提现资金与空投" title="" id="33" name="Picture"/>
             <a:graphic>
               <a:graphicData uri="http://schemas.openxmlformats.org/drawingml/2006/picture">
                 <pic:pic>
                   <pic:nvPicPr>
-                    <pic:cNvPr descr="pic/测试网添加.png" id="35" name="Picture"/>
+                    <pic:cNvPr descr="pic/可提现的资金和空投.jpg" id="34" name="Picture"/>
                     <pic:cNvPicPr>
                       <a:picLocks noChangeArrowheads="1" noChangeAspect="1"/>
                     </pic:cNvPicPr>
                   </pic:nvPicPr>
                   <pic:blipFill>
-                    <a:blip r:embed="rId33"/>
+                    <a:blip r:embed="rId32"/>
                     <a:stretch>
                       <a:fillRect/>
                     </a:stretch>
@@ -718,6 +684,40 @@
         </w:drawing>
       </w:r>
     </w:p>
+    <w:bookmarkEnd w:id="35"/>
+    <w:bookmarkStart w:id="36" w:name="空投信息"/>
+    <w:p>
+      <w:pPr>
+        <w:pStyle w:val="Heading3"/>
+      </w:pPr>
+      <w:r>
+        <w:t xml:space="preserve">4. 空投信息</w:t>
+      </w:r>
+    </w:p>
+    <w:p>
+      <w:pPr>
+        <w:pStyle w:val="Compact"/>
+        <w:numPr>
+          <w:ilvl w:val="0"/>
+          <w:numId w:val="1008"/>
+        </w:numPr>
+      </w:pPr>
+      <w:r>
+        <w:t xml:space="preserve">「空投挂单」会显示最近中奖者（地址 + 奖金 + 下一区块可领取），若显示“当前无挂单”说明还没人中奖或已结算。</w:t>
+      </w:r>
+    </w:p>
+    <w:p>
+      <w:pPr>
+        <w:pStyle w:val="Compact"/>
+        <w:numPr>
+          <w:ilvl w:val="0"/>
+          <w:numId w:val="1008"/>
+        </w:numPr>
+      </w:pPr>
+      <w:r>
+        <w:t xml:space="preserve">若中奖，需要等待至少 1 个区块，再点击「结算空投」或等待系统自动结算。</w:t>
+      </w:r>
+    </w:p>
     <w:bookmarkEnd w:id="36"/>
     <w:bookmarkStart w:id="40" w:name="邀请列表"/>
     <w:p>
@@ -725,7 +725,7 @@
         <w:pStyle w:val="Heading3"/>
       </w:pPr>
       <w:r>
-        <w:t xml:space="preserve">6. 邀请列表</w:t>
+        <w:t xml:space="preserve">5. 邀请列表</w:t>
       </w:r>
     </w:p>
     <w:p>
@@ -1992,40 +1992,40 @@
     <w:abstractNumId w:val="991"/>
   </w:num>
   <w:num w:numId="1002">
-    <w:abstractNumId w:val="99411"/>
-    <w:lvlOverride w:ilvl="0">
-      <w:startOverride w:val="1"/>
-    </w:lvlOverride>
-    <w:lvlOverride w:ilvl="1">
-      <w:startOverride w:val="1"/>
-    </w:lvlOverride>
-    <w:lvlOverride w:ilvl="2">
-      <w:startOverride w:val="1"/>
-    </w:lvlOverride>
-    <w:lvlOverride w:ilvl="3">
-      <w:startOverride w:val="1"/>
-    </w:lvlOverride>
-    <w:lvlOverride w:ilvl="4">
-      <w:startOverride w:val="1"/>
-    </w:lvlOverride>
-    <w:lvlOverride w:ilvl="5">
-      <w:startOverride w:val="1"/>
-    </w:lvlOverride>
-    <w:lvlOverride w:ilvl="6">
-      <w:startOverride w:val="1"/>
-    </w:lvlOverride>
-    <w:lvlOverride w:ilvl="7">
-      <w:startOverride w:val="1"/>
-    </w:lvlOverride>
-    <w:lvlOverride w:ilvl="8">
-      <w:startOverride w:val="1"/>
-    </w:lvlOverride>
+    <w:abstractNumId w:val="991"/>
   </w:num>
   <w:num w:numId="1003">
     <w:abstractNumId w:val="991"/>
   </w:num>
   <w:num w:numId="1004">
-    <w:abstractNumId w:val="991"/>
+    <w:abstractNumId w:val="99411"/>
+    <w:lvlOverride w:ilvl="0">
+      <w:startOverride w:val="1"/>
+    </w:lvlOverride>
+    <w:lvlOverride w:ilvl="1">
+      <w:startOverride w:val="1"/>
+    </w:lvlOverride>
+    <w:lvlOverride w:ilvl="2">
+      <w:startOverride w:val="1"/>
+    </w:lvlOverride>
+    <w:lvlOverride w:ilvl="3">
+      <w:startOverride w:val="1"/>
+    </w:lvlOverride>
+    <w:lvlOverride w:ilvl="4">
+      <w:startOverride w:val="1"/>
+    </w:lvlOverride>
+    <w:lvlOverride w:ilvl="5">
+      <w:startOverride w:val="1"/>
+    </w:lvlOverride>
+    <w:lvlOverride w:ilvl="6">
+      <w:startOverride w:val="1"/>
+    </w:lvlOverride>
+    <w:lvlOverride w:ilvl="7">
+      <w:startOverride w:val="1"/>
+    </w:lvlOverride>
+    <w:lvlOverride w:ilvl="8">
+      <w:startOverride w:val="1"/>
+    </w:lvlOverride>
   </w:num>
   <w:num w:numId="1005">
     <w:abstractNumId w:val="991"/>

</xml_diff>

<commit_message>
docs: place test data after testnet setup
</commit_message>
<xml_diff>
--- a/docs/thePlayer/tests/thePlayer-guide.docx
+++ b/docs/thePlayer/tests/thePlayer-guide.docx
@@ -247,6 +247,20 @@
             </a:graphic>
           </wp:inline>
         </w:drawing>
+      </w:r>
+    </w:p>
+    <w:p>
+      <w:r>
+        <w:pict>
+          <v:rect style="width:0;height:1.5pt" o:hralign="center" o:hrstd="t" o:hr="t"/>
+        </w:pict>
+      </w:r>
+    </w:p>
+    <w:p>
+      <w:r>
+        <w:pict>
+          <v:rect style="width:0;height:1.5pt" o:hralign="center" o:hrstd="t" o:hr="t"/>
+        </w:pict>
       </w:r>
     </w:p>
     <w:bookmarkEnd w:id="23"/>

</xml_diff>

<commit_message>
docs: move test prep to top
</commit_message>
<xml_diff>
--- a/docs/thePlayer/tests/thePlayer-guide.docx
+++ b/docs/thePlayer/tests/thePlayer-guide.docx
@@ -46,16 +46,452 @@
         </w:pict>
       </w:r>
     </w:p>
-    <w:bookmarkStart w:id="41" w:name="玩家流程"/>
+    <w:bookmarkStart w:id="22" w:name="测试准备工作"/>
     <w:p>
       <w:pPr>
         <w:pStyle w:val="Heading2"/>
       </w:pPr>
       <w:r>
+        <w:t xml:space="preserve">测试准备工作</w:t>
+      </w:r>
+    </w:p>
+    <w:p>
+      <w:pPr>
+        <w:pStyle w:val="BlockText"/>
+      </w:pPr>
+      <w:r>
+        <w:t xml:space="preserve">仅供测试使用，包含私钥和敏感地址，请勿泄露或在主网使用。请先完成网络添加、地址导入，再进行后续操作。</w:t>
+      </w:r>
+    </w:p>
+    <w:p>
+      <w:pPr>
+        <w:pStyle w:val="Compact"/>
+        <w:numPr>
+          <w:ilvl w:val="0"/>
+          <w:numId w:val="1001"/>
+        </w:numPr>
+      </w:pPr>
+      <w:r>
+        <w:rPr>
+          <w:b/>
+          <w:bCs/>
+        </w:rPr>
+        <w:t xml:space="preserve">管理员地址</w:t>
+      </w:r>
+      <w:r>
+        <w:t xml:space="preserve">：</w:t>
+      </w:r>
+      <w:r>
+        <w:rPr>
+          <w:rStyle w:val="VerbatimChar"/>
+        </w:rPr>
+        <w:t xml:space="preserve">0x6c62d0c68071335f6fdf7bfe7d866659ad1b0061</w:t>
+      </w:r>
+      <w:r>
+        <w:br/>
+      </w:r>
+      <w:r>
+        <w:rPr>
+          <w:b/>
+          <w:bCs/>
+        </w:rPr>
+        <w:t xml:space="preserve">管理员私钥</w:t>
+      </w:r>
+      <w:r>
+        <w:t xml:space="preserve">：</w:t>
+      </w:r>
+      <w:r>
+        <w:rPr>
+          <w:rStyle w:val="VerbatimChar"/>
+        </w:rPr>
+        <w:t xml:space="preserve">7cc046fe6c3a6528d9861d1d162edadb90cd818a584c705d172b7d619bdde140</w:t>
+      </w:r>
+    </w:p>
+    <w:p>
+      <w:pPr>
+        <w:pStyle w:val="Compact"/>
+        <w:numPr>
+          <w:ilvl w:val="0"/>
+          <w:numId w:val="1001"/>
+        </w:numPr>
+      </w:pPr>
+      <w:r>
+        <w:rPr>
+          <w:b/>
+          <w:bCs/>
+        </w:rPr>
+        <w:t xml:space="preserve">开发者国库地址</w:t>
+      </w:r>
+      <w:r>
+        <w:t xml:space="preserve">：</w:t>
+      </w:r>
+      <w:r>
+        <w:rPr>
+          <w:rStyle w:val="VerbatimChar"/>
+        </w:rPr>
+        <w:t xml:space="preserve">0x8224fbbdc261759cbf861c16394a9141c5575c25</w:t>
+      </w:r>
+      <w:r>
+        <w:br/>
+      </w:r>
+      <w:r>
+        <w:rPr>
+          <w:b/>
+          <w:bCs/>
+        </w:rPr>
+        <w:t xml:space="preserve">私钥</w:t>
+      </w:r>
+      <w:r>
+        <w:t xml:space="preserve">：</w:t>
+      </w:r>
+      <w:r>
+        <w:rPr>
+          <w:rStyle w:val="VerbatimChar"/>
+        </w:rPr>
+        <w:t xml:space="preserve">d74168aed1725675c2041c4d34bdfa32530ee6575241354ef6b84963a571e59c</w:t>
+      </w:r>
+    </w:p>
+    <w:p>
+      <w:pPr>
+        <w:pStyle w:val="Compact"/>
+        <w:numPr>
+          <w:ilvl w:val="0"/>
+          <w:numId w:val="1001"/>
+        </w:numPr>
+      </w:pPr>
+      <w:r>
+        <w:rPr>
+          <w:b/>
+          <w:bCs/>
+        </w:rPr>
+        <w:t xml:space="preserve">社区基金地址</w:t>
+      </w:r>
+      <w:r>
+        <w:t xml:space="preserve">：</w:t>
+      </w:r>
+      <w:r>
+        <w:rPr>
+          <w:rStyle w:val="VerbatimChar"/>
+        </w:rPr>
+        <w:t xml:space="preserve">0xb11b018c1d6f093cbe5e50e76fd9ed4c70f90c79</w:t>
+      </w:r>
+      <w:r>
+        <w:br/>
+      </w:r>
+      <w:r>
+        <w:rPr>
+          <w:b/>
+          <w:bCs/>
+        </w:rPr>
+        <w:t xml:space="preserve">私钥</w:t>
+      </w:r>
+      <w:r>
+        <w:t xml:space="preserve">：</w:t>
+      </w:r>
+      <w:r>
+        <w:rPr>
+          <w:rStyle w:val="VerbatimChar"/>
+        </w:rPr>
+        <w:t xml:space="preserve">9e7d9b96c2306237b8c1ff8ee4094c03761b835f183f6519b3a7567f7c4bcd02</w:t>
+      </w:r>
+    </w:p>
+    <w:p>
+      <w:pPr>
+        <w:pStyle w:val="Compact"/>
+        <w:numPr>
+          <w:ilvl w:val="0"/>
+          <w:numId w:val="1001"/>
+        </w:numPr>
+      </w:pPr>
+      <w:r>
+        <w:rPr>
+          <w:b/>
+          <w:bCs/>
+        </w:rPr>
+        <w:t xml:space="preserve">USDT 测试代币地址</w:t>
+      </w:r>
+      <w:r>
+        <w:t xml:space="preserve">：</w:t>
+      </w:r>
+      <w:r>
+        <w:rPr>
+          <w:rStyle w:val="VerbatimChar"/>
+        </w:rPr>
+        <w:t xml:space="preserve">0x26dd16D5B9708032872a7cD10C100b0FcE4E79a9</w:t>
+      </w:r>
+    </w:p>
+    <w:bookmarkStart w:id="20" w:name="推荐关系测试地址"/>
+    <w:p>
+      <w:pPr>
+        <w:pStyle w:val="Heading3"/>
+      </w:pPr>
+      <w:r>
+        <w:t xml:space="preserve">推荐关系测试地址</w:t>
+      </w:r>
+    </w:p>
+    <w:p>
+      <w:pPr>
+        <w:pStyle w:val="Compact"/>
+        <w:numPr>
+          <w:ilvl w:val="0"/>
+          <w:numId w:val="1002"/>
+        </w:numPr>
+      </w:pPr>
+      <w:r>
+        <w:rPr>
+          <w:b/>
+          <w:bCs/>
+        </w:rPr>
+        <w:t xml:space="preserve">买票人</w:t>
+      </w:r>
+      <w:r>
+        <w:t xml:space="preserve">：</w:t>
+      </w:r>
+      <w:r>
+        <w:rPr>
+          <w:rStyle w:val="VerbatimChar"/>
+        </w:rPr>
+        <w:t xml:space="preserve">0x122e268a49b3b617af62be87393b214894c7a674</w:t>
+      </w:r>
+      <w:r>
+        <w:br/>
+      </w:r>
+      <w:r>
+        <w:rPr>
+          <w:b/>
+          <w:bCs/>
+        </w:rPr>
+        <w:t xml:space="preserve">私钥</w:t>
+      </w:r>
+      <w:r>
+        <w:t xml:space="preserve">：</w:t>
+      </w:r>
+      <w:r>
+        <w:rPr>
+          <w:rStyle w:val="VerbatimChar"/>
+        </w:rPr>
+        <w:t xml:space="preserve">89cc918e6bdb4c46c49c8a3c5f2807f98f55109fa64d088fcbdef6099a47a89a</w:t>
+      </w:r>
+    </w:p>
+    <w:p>
+      <w:pPr>
+        <w:pStyle w:val="Compact"/>
+        <w:numPr>
+          <w:ilvl w:val="0"/>
+          <w:numId w:val="1002"/>
+        </w:numPr>
+      </w:pPr>
+      <w:r>
+        <w:rPr>
+          <w:b/>
+          <w:bCs/>
+        </w:rPr>
+        <w:t xml:space="preserve">邀请人（直推）</w:t>
+      </w:r>
+      <w:r>
+        <w:t xml:space="preserve">：</w:t>
+      </w:r>
+      <w:r>
+        <w:rPr>
+          <w:rStyle w:val="VerbatimChar"/>
+        </w:rPr>
+        <w:t xml:space="preserve">0x2cf5446b1d01fbf0be6e895f1c26b2a6a40ad3d7</w:t>
+      </w:r>
+      <w:r>
+        <w:br/>
+      </w:r>
+      <w:r>
+        <w:rPr>
+          <w:b/>
+          <w:bCs/>
+        </w:rPr>
+        <w:t xml:space="preserve">私钥</w:t>
+      </w:r>
+      <w:r>
+        <w:t xml:space="preserve">：</w:t>
+      </w:r>
+      <w:r>
+        <w:rPr>
+          <w:rStyle w:val="VerbatimChar"/>
+        </w:rPr>
+        <w:t xml:space="preserve">113f848e2c433dcefd7bd62227fcda34269e12f138ebf430189277a63ecbdacb</w:t>
+      </w:r>
+    </w:p>
+    <w:p>
+      <w:pPr>
+        <w:pStyle w:val="Compact"/>
+        <w:numPr>
+          <w:ilvl w:val="0"/>
+          <w:numId w:val="1002"/>
+        </w:numPr>
+      </w:pPr>
+      <w:r>
+        <w:rPr>
+          <w:b/>
+          <w:bCs/>
+        </w:rPr>
+        <w:t xml:space="preserve">间接邀请人</w:t>
+      </w:r>
+      <w:r>
+        <w:t xml:space="preserve">：</w:t>
+      </w:r>
+      <w:r>
+        <w:rPr>
+          <w:rStyle w:val="VerbatimChar"/>
+        </w:rPr>
+        <w:t xml:space="preserve">0xb8ee25e6f4e993406180fe9fdfca0c935605a39c</w:t>
+      </w:r>
+      <w:r>
+        <w:br/>
+      </w:r>
+      <w:r>
+        <w:rPr>
+          <w:b/>
+          <w:bCs/>
+        </w:rPr>
+        <w:t xml:space="preserve">私钥</w:t>
+      </w:r>
+      <w:r>
+        <w:t xml:space="preserve">：</w:t>
+      </w:r>
+      <w:r>
+        <w:rPr>
+          <w:rStyle w:val="VerbatimChar"/>
+        </w:rPr>
+        <w:t xml:space="preserve">fa3cdf14159a270ca6da44567b3d99dfcbe007f42b8bceab62e01110fc57ba84</w:t>
+      </w:r>
+    </w:p>
+    <w:bookmarkEnd w:id="20"/>
+    <w:bookmarkStart w:id="21" w:name="管理员预置空投地址"/>
+    <w:p>
+      <w:pPr>
+        <w:pStyle w:val="Heading3"/>
+      </w:pPr>
+      <w:r>
+        <w:t xml:space="preserve">管理员预置空投地址</w:t>
+      </w:r>
+    </w:p>
+    <w:p>
+      <w:pPr>
+        <w:pStyle w:val="Compact"/>
+        <w:numPr>
+          <w:ilvl w:val="0"/>
+          <w:numId w:val="1003"/>
+        </w:numPr>
+      </w:pPr>
+      <w:r>
+        <w:rPr>
+          <w:rStyle w:val="VerbatimChar"/>
+        </w:rPr>
+        <w:t xml:space="preserve">0x9e77389505ccd3d89e11109b3ec96d8458603ffe</w:t>
+      </w:r>
+      <w:r>
+        <w:br/>
+      </w:r>
+      <w:r>
+        <w:rPr>
+          <w:b/>
+          <w:bCs/>
+        </w:rPr>
+        <w:t xml:space="preserve">私钥</w:t>
+      </w:r>
+      <w:r>
+        <w:t xml:space="preserve">：</w:t>
+      </w:r>
+      <w:r>
+        <w:rPr>
+          <w:rStyle w:val="VerbatimChar"/>
+        </w:rPr>
+        <w:t xml:space="preserve">418fd094258cd4f17e8ad197fe07e15321c3f07deac1b59cea98cf6342ae4549</w:t>
+      </w:r>
+    </w:p>
+    <w:p>
+      <w:pPr>
+        <w:pStyle w:val="Compact"/>
+        <w:numPr>
+          <w:ilvl w:val="0"/>
+          <w:numId w:val="1003"/>
+        </w:numPr>
+      </w:pPr>
+      <w:r>
+        <w:rPr>
+          <w:rStyle w:val="VerbatimChar"/>
+        </w:rPr>
+        <w:t xml:space="preserve">0xdf122a018c12d6129205f98a8c8758f4f2ff37c3</w:t>
+      </w:r>
+      <w:r>
+        <w:br/>
+      </w:r>
+      <w:r>
+        <w:rPr>
+          <w:b/>
+          <w:bCs/>
+        </w:rPr>
+        <w:t xml:space="preserve">私钥</w:t>
+      </w:r>
+      <w:r>
+        <w:t xml:space="preserve">：</w:t>
+      </w:r>
+      <w:r>
+        <w:rPr>
+          <w:rStyle w:val="VerbatimChar"/>
+        </w:rPr>
+        <w:t xml:space="preserve">1fe977553945e7a7d960654020cb8b378229bf42607ad174616732ba04886533</w:t>
+      </w:r>
+    </w:p>
+    <w:p>
+      <w:pPr>
+        <w:pStyle w:val="Compact"/>
+        <w:numPr>
+          <w:ilvl w:val="0"/>
+          <w:numId w:val="1003"/>
+        </w:numPr>
+      </w:pPr>
+      <w:r>
+        <w:rPr>
+          <w:rStyle w:val="VerbatimChar"/>
+        </w:rPr>
+        <w:t xml:space="preserve">0x02b6438f76d32d6195f25e122af0a71d9067f9f8</w:t>
+      </w:r>
+      <w:r>
+        <w:br/>
+      </w:r>
+      <w:r>
+        <w:rPr>
+          <w:b/>
+          <w:bCs/>
+        </w:rPr>
+        <w:t xml:space="preserve">私钥</w:t>
+      </w:r>
+      <w:r>
+        <w:t xml:space="preserve">：</w:t>
+      </w:r>
+      <w:r>
+        <w:rPr>
+          <w:rStyle w:val="VerbatimChar"/>
+        </w:rPr>
+        <w:t xml:space="preserve">93bc67ddaea266c3fcba97d2fd146972d8f60d52d5e4cc0d0e7cdb5604cab442</w:t>
+      </w:r>
+    </w:p>
+    <w:p>
+      <w:r>
+        <w:pict>
+          <v:rect style="width:0;height:1.5pt" o:hralign="center" o:hrstd="t" o:hr="t"/>
+        </w:pict>
+      </w:r>
+    </w:p>
+    <w:bookmarkEnd w:id="21"/>
+    <w:bookmarkEnd w:id="22"/>
+    <w:bookmarkStart w:id="44" w:name="玩家流程"/>
+    <w:p>
+      <w:pPr>
+        <w:pStyle w:val="Heading2"/>
+      </w:pPr>
+      <w:r>
         <w:t xml:space="preserve">玩家流程</w:t>
       </w:r>
     </w:p>
-    <w:bookmarkStart w:id="23" w:name="添加-bsc-测试网链配置"/>
+    <w:bookmarkStart w:id="26" w:name="添加-bsc-测试网链配置"/>
     <w:p>
       <w:pPr>
         <w:pStyle w:val="Heading3"/>
@@ -69,7 +505,7 @@
         <w:pStyle w:val="Compact"/>
         <w:numPr>
           <w:ilvl w:val="0"/>
-          <w:numId w:val="1001"/>
+          <w:numId w:val="1004"/>
         </w:numPr>
       </w:pPr>
       <w:r>
@@ -129,7 +565,7 @@
         <w:pStyle w:val="Compact"/>
         <w:numPr>
           <w:ilvl w:val="0"/>
-          <w:numId w:val="1001"/>
+          <w:numId w:val="1004"/>
         </w:numPr>
       </w:pPr>
       <w:r>
@@ -141,7 +577,7 @@
         <w:pStyle w:val="Compact"/>
         <w:numPr>
           <w:ilvl w:val="1"/>
-          <w:numId w:val="1002"/>
+          <w:numId w:val="1005"/>
         </w:numPr>
       </w:pPr>
       <w:r>
@@ -153,7 +589,7 @@
         <w:pStyle w:val="Compact"/>
         <w:numPr>
           <w:ilvl w:val="1"/>
-          <w:numId w:val="1002"/>
+          <w:numId w:val="1005"/>
         </w:numPr>
       </w:pPr>
       <w:r>
@@ -165,7 +601,7 @@
         <w:pStyle w:val="Compact"/>
         <w:numPr>
           <w:ilvl w:val="1"/>
-          <w:numId w:val="1002"/>
+          <w:numId w:val="1005"/>
         </w:numPr>
       </w:pPr>
       <w:r>
@@ -177,7 +613,7 @@
         <w:pStyle w:val="Compact"/>
         <w:numPr>
           <w:ilvl w:val="1"/>
-          <w:numId w:val="1002"/>
+          <w:numId w:val="1005"/>
         </w:numPr>
       </w:pPr>
       <w:r>
@@ -189,7 +625,7 @@
         <w:pStyle w:val="Compact"/>
         <w:numPr>
           <w:ilvl w:val="1"/>
-          <w:numId w:val="1002"/>
+          <w:numId w:val="1005"/>
         </w:numPr>
       </w:pPr>
       <w:r>
@@ -211,18 +647,18 @@
           <wp:inline>
             <wp:extent cx="5334000" cy="11559778"/>
             <wp:effectExtent b="0" l="0" r="0" t="0"/>
-            <wp:docPr descr="测试网添加" title="" id="21" name="Picture"/>
+            <wp:docPr descr="测试网添加" title="" id="24" name="Picture"/>
             <a:graphic>
               <a:graphicData uri="http://schemas.openxmlformats.org/drawingml/2006/picture">
                 <pic:pic>
                   <pic:nvPicPr>
-                    <pic:cNvPr descr="pic/测试网添加.png" id="22" name="Picture"/>
+                    <pic:cNvPr descr="pic/测试网添加.png" id="25" name="Picture"/>
                     <pic:cNvPicPr>
                       <a:picLocks noChangeArrowheads="1" noChangeAspect="1"/>
                     </pic:cNvPicPr>
                   </pic:nvPicPr>
                   <pic:blipFill>
-                    <a:blip r:embed="rId20"/>
+                    <a:blip r:embed="rId23"/>
                     <a:stretch>
                       <a:fillRect/>
                     </a:stretch>
@@ -256,15 +692,8 @@
         </w:pict>
       </w:r>
     </w:p>
-    <w:p>
-      <w:r>
-        <w:pict>
-          <v:rect style="width:0;height:1.5pt" o:hralign="center" o:hrstd="t" o:hr="t"/>
-        </w:pict>
-      </w:r>
-    </w:p>
-    <w:bookmarkEnd w:id="23"/>
-    <w:bookmarkStart w:id="24" w:name="连接钱包"/>
+    <w:bookmarkEnd w:id="26"/>
+    <w:bookmarkStart w:id="27" w:name="连接钱包"/>
     <w:p>
       <w:pPr>
         <w:pStyle w:val="Heading3"/>
@@ -278,7 +707,7 @@
         <w:pStyle w:val="Compact"/>
         <w:numPr>
           <w:ilvl w:val="0"/>
-          <w:numId w:val="1003"/>
+          <w:numId w:val="1006"/>
         </w:numPr>
       </w:pPr>
       <w:r>
@@ -290,15 +719,15 @@
         <w:pStyle w:val="Compact"/>
         <w:numPr>
           <w:ilvl w:val="0"/>
-          <w:numId w:val="1003"/>
+          <w:numId w:val="1006"/>
         </w:numPr>
       </w:pPr>
       <w:r>
         <w:t xml:space="preserve">成功连接后，界面会显示当前账号缩写。</w:t>
       </w:r>
     </w:p>
-    <w:bookmarkEnd w:id="24"/>
-    <w:bookmarkStart w:id="28" w:name="购票步骤"/>
+    <w:bookmarkEnd w:id="27"/>
+    <w:bookmarkStart w:id="31" w:name="购票步骤"/>
     <w:p>
       <w:pPr>
         <w:pStyle w:val="Heading3"/>
@@ -312,7 +741,7 @@
         <w:pStyle w:val="Compact"/>
         <w:numPr>
           <w:ilvl w:val="0"/>
-          <w:numId w:val="1004"/>
+          <w:numId w:val="1007"/>
         </w:numPr>
       </w:pPr>
       <w:r>
@@ -333,7 +762,7 @@
         <w:pStyle w:val="Compact"/>
         <w:numPr>
           <w:ilvl w:val="0"/>
-          <w:numId w:val="1004"/>
+          <w:numId w:val="1007"/>
         </w:numPr>
       </w:pPr>
       <w:r>
@@ -345,7 +774,7 @@
         <w:pStyle w:val="Compact"/>
         <w:numPr>
           <w:ilvl w:val="0"/>
-          <w:numId w:val="1004"/>
+          <w:numId w:val="1007"/>
         </w:numPr>
       </w:pPr>
       <w:r>
@@ -357,7 +786,7 @@
         <w:pStyle w:val="Compact"/>
         <w:numPr>
           <w:ilvl w:val="0"/>
-          <w:numId w:val="1004"/>
+          <w:numId w:val="1007"/>
         </w:numPr>
       </w:pPr>
       <w:r>
@@ -423,18 +852,18 @@
           <wp:inline>
             <wp:extent cx="5334000" cy="11559778"/>
             <wp:effectExtent b="0" l="0" r="0" t="0"/>
-            <wp:docPr descr="购票界面" title="" id="26" name="Picture"/>
+            <wp:docPr descr="购票界面" title="" id="29" name="Picture"/>
             <a:graphic>
               <a:graphicData uri="http://schemas.openxmlformats.org/drawingml/2006/picture">
                 <pic:pic>
                   <pic:nvPicPr>
-                    <pic:cNvPr descr="pic/购买门票1.png" id="27" name="Picture"/>
+                    <pic:cNvPr descr="pic/购买门票1.png" id="30" name="Picture"/>
                     <pic:cNvPicPr>
                       <a:picLocks noChangeArrowheads="1" noChangeAspect="1"/>
                     </pic:cNvPicPr>
                   </pic:nvPicPr>
                   <pic:blipFill>
-                    <a:blip r:embed="rId25"/>
+                    <a:blip r:embed="rId28"/>
                     <a:stretch>
                       <a:fillRect/>
                     </a:stretch>
@@ -461,8 +890,8 @@
         </w:drawing>
       </w:r>
     </w:p>
-    <w:bookmarkEnd w:id="28"/>
-    <w:bookmarkStart w:id="35" w:name="收益查看"/>
+    <w:bookmarkEnd w:id="31"/>
+    <w:bookmarkStart w:id="38" w:name="收益查看"/>
     <w:p>
       <w:pPr>
         <w:pStyle w:val="Heading3"/>
@@ -476,7 +905,7 @@
         <w:pStyle w:val="Compact"/>
         <w:numPr>
           <w:ilvl w:val="0"/>
-          <w:numId w:val="1005"/>
+          <w:numId w:val="1008"/>
         </w:numPr>
       </w:pPr>
       <w:r>
@@ -488,7 +917,7 @@
         <w:pStyle w:val="Compact"/>
         <w:numPr>
           <w:ilvl w:val="1"/>
-          <w:numId w:val="1006"/>
+          <w:numId w:val="1009"/>
         </w:numPr>
       </w:pPr>
       <w:r>
@@ -510,7 +939,7 @@
         <w:pStyle w:val="Compact"/>
         <w:numPr>
           <w:ilvl w:val="1"/>
-          <w:numId w:val="1006"/>
+          <w:numId w:val="1009"/>
         </w:numPr>
       </w:pPr>
       <w:r>
@@ -532,7 +961,7 @@
         <w:pStyle w:val="Compact"/>
         <w:numPr>
           <w:ilvl w:val="1"/>
-          <w:numId w:val="1006"/>
+          <w:numId w:val="1009"/>
         </w:numPr>
       </w:pPr>
       <w:r>
@@ -551,7 +980,7 @@
         <w:pStyle w:val="Compact"/>
         <w:numPr>
           <w:ilvl w:val="0"/>
-          <w:numId w:val="1005"/>
+          <w:numId w:val="1008"/>
         </w:numPr>
       </w:pPr>
       <w:r>
@@ -563,7 +992,7 @@
         <w:pStyle w:val="Compact"/>
         <w:numPr>
           <w:ilvl w:val="1"/>
-          <w:numId w:val="1007"/>
+          <w:numId w:val="1010"/>
         </w:numPr>
       </w:pPr>
       <w:r>
@@ -578,7 +1007,7 @@
         <w:pStyle w:val="Compact"/>
         <w:numPr>
           <w:ilvl w:val="1"/>
-          <w:numId w:val="1007"/>
+          <w:numId w:val="1010"/>
         </w:numPr>
       </w:pPr>
       <w:r>
@@ -593,7 +1022,7 @@
         <w:pStyle w:val="Compact"/>
         <w:numPr>
           <w:ilvl w:val="1"/>
-          <w:numId w:val="1007"/>
+          <w:numId w:val="1010"/>
         </w:numPr>
       </w:pPr>
       <w:r>
@@ -615,57 +1044,12 @@
           <wp:inline>
             <wp:extent cx="5334000" cy="11559778"/>
             <wp:effectExtent b="0" l="0" r="0" t="0"/>
-            <wp:docPr descr="收益面板" title="" id="30" name="Picture"/>
+            <wp:docPr descr="收益面板" title="" id="33" name="Picture"/>
             <a:graphic>
               <a:graphicData uri="http://schemas.openxmlformats.org/drawingml/2006/picture">
                 <pic:pic>
                   <pic:nvPicPr>
-                    <pic:cNvPr descr="pic/查看收益.jpg" id="31" name="Picture"/>
-                    <pic:cNvPicPr>
-                      <a:picLocks noChangeArrowheads="1" noChangeAspect="1"/>
-                    </pic:cNvPicPr>
-                  </pic:nvPicPr>
-                  <pic:blipFill>
-                    <a:blip r:embed="rId29"/>
-                    <a:stretch>
-                      <a:fillRect/>
-                    </a:stretch>
-                  </pic:blipFill>
-                  <pic:spPr bwMode="auto">
-                    <a:xfrm>
-                      <a:off x="0" y="0"/>
-                      <a:ext cx="5334000" cy="11559778"/>
-                    </a:xfrm>
-                    <a:prstGeom prst="rect">
-                      <a:avLst/>
-                    </a:prstGeom>
-                    <a:noFill/>
-                    <a:ln w="9525">
-                      <a:noFill/>
-                      <a:headEnd/>
-                      <a:tailEnd/>
-                    </a:ln>
-                  </pic:spPr>
-                </pic:pic>
-              </a:graphicData>
-            </a:graphic>
-          </wp:inline>
-        </w:drawing>
-      </w:r>
-      <w:r>
-        <w:br/>
-      </w:r>
-      <w:r>
-        <w:drawing>
-          <wp:inline>
-            <wp:extent cx="5334000" cy="11559778"/>
-            <wp:effectExtent b="0" l="0" r="0" t="0"/>
-            <wp:docPr descr="可提现资金与空投" title="" id="33" name="Picture"/>
-            <a:graphic>
-              <a:graphicData uri="http://schemas.openxmlformats.org/drawingml/2006/picture">
-                <pic:pic>
-                  <pic:nvPicPr>
-                    <pic:cNvPr descr="pic/可提现的资金和空投.jpg" id="34" name="Picture"/>
+                    <pic:cNvPr descr="pic/查看收益.jpg" id="34" name="Picture"/>
                     <pic:cNvPicPr>
                       <a:picLocks noChangeArrowheads="1" noChangeAspect="1"/>
                     </pic:cNvPicPr>
@@ -697,70 +1081,6 @@
           </wp:inline>
         </w:drawing>
       </w:r>
-    </w:p>
-    <w:bookmarkEnd w:id="35"/>
-    <w:bookmarkStart w:id="36" w:name="空投信息"/>
-    <w:p>
-      <w:pPr>
-        <w:pStyle w:val="Heading3"/>
-      </w:pPr>
-      <w:r>
-        <w:t xml:space="preserve">4. 空投信息</w:t>
-      </w:r>
-    </w:p>
-    <w:p>
-      <w:pPr>
-        <w:pStyle w:val="Compact"/>
-        <w:numPr>
-          <w:ilvl w:val="0"/>
-          <w:numId w:val="1008"/>
-        </w:numPr>
-      </w:pPr>
-      <w:r>
-        <w:t xml:space="preserve">「空投挂单」会显示最近中奖者（地址 + 奖金 + 下一区块可领取），若显示“当前无挂单”说明还没人中奖或已结算。</w:t>
-      </w:r>
-    </w:p>
-    <w:p>
-      <w:pPr>
-        <w:pStyle w:val="Compact"/>
-        <w:numPr>
-          <w:ilvl w:val="0"/>
-          <w:numId w:val="1008"/>
-        </w:numPr>
-      </w:pPr>
-      <w:r>
-        <w:t xml:space="preserve">若中奖，需要等待至少 1 个区块，再点击「结算空投」或等待系统自动结算。</w:t>
-      </w:r>
-    </w:p>
-    <w:bookmarkEnd w:id="36"/>
-    <w:bookmarkStart w:id="40" w:name="邀请列表"/>
-    <w:p>
-      <w:pPr>
-        <w:pStyle w:val="Heading3"/>
-      </w:pPr>
-      <w:r>
-        <w:t xml:space="preserve">5. 邀请列表</w:t>
-      </w:r>
-    </w:p>
-    <w:p>
-      <w:pPr>
-        <w:pStyle w:val="Compact"/>
-        <w:numPr>
-          <w:ilvl w:val="0"/>
-          <w:numId w:val="1009"/>
-        </w:numPr>
-      </w:pPr>
-      <w:r>
-        <w:t xml:space="preserve">进入「邀请玩家」选项卡，可分页查看直推和间推地址，方便管理团队关系。</w:t>
-      </w:r>
-    </w:p>
-    <w:p>
-      <w:pPr>
-        <w:pStyle w:val="FirstParagraph"/>
-      </w:pPr>
-      <w:r>
-        <w:t xml:space="preserve">界面示例：</w:t>
-      </w:r>
       <w:r>
         <w:br/>
       </w:r>
@@ -769,18 +1089,18 @@
           <wp:inline>
             <wp:extent cx="5334000" cy="11559778"/>
             <wp:effectExtent b="0" l="0" r="0" t="0"/>
-            <wp:docPr descr="邀请列表示例" title="" id="38" name="Picture"/>
+            <wp:docPr descr="可提现资金与空投" title="" id="36" name="Picture"/>
             <a:graphic>
               <a:graphicData uri="http://schemas.openxmlformats.org/drawingml/2006/picture">
                 <pic:pic>
                   <pic:nvPicPr>
-                    <pic:cNvPr descr="pic/推荐列表.jpg" id="39" name="Picture"/>
+                    <pic:cNvPr descr="pic/可提现的资金和空投.jpg" id="37" name="Picture"/>
                     <pic:cNvPicPr>
                       <a:picLocks noChangeArrowheads="1" noChangeAspect="1"/>
                     </pic:cNvPicPr>
                   </pic:nvPicPr>
                   <pic:blipFill>
-                    <a:blip r:embed="rId37"/>
+                    <a:blip r:embed="rId35"/>
                     <a:stretch>
                       <a:fillRect/>
                     </a:stretch>
@@ -807,236 +1127,60 @@
         </w:drawing>
       </w:r>
     </w:p>
-    <w:p>
-      <w:r>
-        <w:pict>
-          <v:rect style="width:0;height:1.5pt" o:hralign="center" o:hrstd="t" o:hr="t"/>
-        </w:pict>
-      </w:r>
-    </w:p>
-    <w:bookmarkEnd w:id="40"/>
-    <w:bookmarkEnd w:id="41"/>
-    <w:bookmarkStart w:id="53" w:name="管理员流程"/>
-    <w:p>
-      <w:pPr>
-        <w:pStyle w:val="Heading2"/>
-      </w:pPr>
-      <w:r>
-        <w:t xml:space="preserve">管理员流程</w:t>
-      </w:r>
-    </w:p>
-    <w:bookmarkStart w:id="42" w:name="连接后台"/>
+    <w:bookmarkEnd w:id="38"/>
+    <w:bookmarkStart w:id="39" w:name="空投信息"/>
     <w:p>
       <w:pPr>
         <w:pStyle w:val="Heading3"/>
       </w:pPr>
       <w:r>
-        <w:t xml:space="preserve">1. 连接后台</w:t>
-      </w:r>
-    </w:p>
-    <w:p>
-      <w:pPr>
-        <w:pStyle w:val="Compact"/>
-        <w:numPr>
-          <w:ilvl w:val="0"/>
-          <w:numId w:val="1010"/>
-        </w:numPr>
-      </w:pPr>
-      <w:r>
-        <w:t xml:space="preserve">使用 Owner 钱包访问管理员端并点击「连接钱包」。非 Owner 无法编辑参数。</w:t>
-      </w:r>
-    </w:p>
-    <w:bookmarkEnd w:id="42"/>
-    <w:bookmarkStart w:id="49" w:name="基本配置"/>
+        <w:t xml:space="preserve">4. 空投信息</w:t>
+      </w:r>
+    </w:p>
+    <w:p>
+      <w:pPr>
+        <w:pStyle w:val="Compact"/>
+        <w:numPr>
+          <w:ilvl w:val="0"/>
+          <w:numId w:val="1011"/>
+        </w:numPr>
+      </w:pPr>
+      <w:r>
+        <w:t xml:space="preserve">「空投挂单」会显示最近中奖者（地址 + 奖金 + 下一区块可领取），若显示“当前无挂单”说明还没人中奖或已结算。</w:t>
+      </w:r>
+    </w:p>
+    <w:p>
+      <w:pPr>
+        <w:pStyle w:val="Compact"/>
+        <w:numPr>
+          <w:ilvl w:val="0"/>
+          <w:numId w:val="1011"/>
+        </w:numPr>
+      </w:pPr>
+      <w:r>
+        <w:t xml:space="preserve">若中奖，需要等待至少 1 个区块，再点击「结算空投」或等待系统自动结算。</w:t>
+      </w:r>
+    </w:p>
+    <w:bookmarkEnd w:id="39"/>
+    <w:bookmarkStart w:id="43" w:name="邀请列表"/>
     <w:p>
       <w:pPr>
         <w:pStyle w:val="Heading3"/>
       </w:pPr>
       <w:r>
-        <w:t xml:space="preserve">2. 基本配置</w:t>
-      </w:r>
-    </w:p>
-    <w:p>
-      <w:pPr>
-        <w:pStyle w:val="Compact"/>
-        <w:numPr>
-          <w:ilvl w:val="0"/>
-          <w:numId w:val="1011"/>
-        </w:numPr>
-      </w:pPr>
-      <w:r>
-        <w:rPr>
-          <w:b/>
-          <w:bCs/>
-        </w:rPr>
-        <w:t xml:space="preserve">票价参数</w:t>
-      </w:r>
-      <w:r>
-        <w:t xml:space="preserve">：可调整基础价与递增价（默认 0.001 / 0.001）。</w:t>
-      </w:r>
-    </w:p>
-    <w:p>
-      <w:pPr>
-        <w:pStyle w:val="Compact"/>
-        <w:numPr>
-          <w:ilvl w:val="0"/>
-          <w:numId w:val="1011"/>
-        </w:numPr>
-      </w:pPr>
-      <w:r>
-        <w:rPr>
-          <w:b/>
-          <w:bCs/>
-        </w:rPr>
-        <w:t xml:space="preserve">回合时间/冷却时间</w:t>
-      </w:r>
-      <w:r>
-        <w:t xml:space="preserve">：默认 24 小时 / 1 小时，可按需求修改。</w:t>
-      </w:r>
-    </w:p>
-    <w:p>
-      <w:pPr>
-        <w:pStyle w:val="Compact"/>
-        <w:numPr>
-          <w:ilvl w:val="0"/>
-          <w:numId w:val="1011"/>
-        </w:numPr>
-      </w:pPr>
-      <w:r>
-        <w:rPr>
-          <w:b/>
-          <w:bCs/>
-        </w:rPr>
-        <w:t xml:space="preserve">空投门槛</w:t>
-      </w:r>
-      <w:r>
-        <w:t xml:space="preserve">：默认 1 USDT。</w:t>
-      </w:r>
-    </w:p>
-    <w:p>
-      <w:pPr>
-        <w:pStyle w:val="Compact"/>
-        <w:numPr>
-          <w:ilvl w:val="0"/>
-          <w:numId w:val="1011"/>
-        </w:numPr>
-      </w:pPr>
-      <w:r>
-        <w:rPr>
-          <w:b/>
-          <w:bCs/>
-        </w:rPr>
-        <w:t xml:space="preserve">开发者国库地址</w:t>
-      </w:r>
-      <w:r>
-        <w:t xml:space="preserve">：</w:t>
-      </w:r>
-      <w:r>
-        <w:rPr>
-          <w:rStyle w:val="VerbatimChar"/>
-        </w:rPr>
-        <w:t xml:space="preserve">0x8224fbbdc261759cbf861c16394a9141c5575c25</w:t>
-      </w:r>
-      <w:r>
-        <w:t xml:space="preserve">。</w:t>
-      </w:r>
-    </w:p>
-    <w:p>
-      <w:pPr>
-        <w:pStyle w:val="Compact"/>
-        <w:numPr>
-          <w:ilvl w:val="0"/>
-          <w:numId w:val="1011"/>
-        </w:numPr>
-      </w:pPr>
-      <w:r>
-        <w:rPr>
-          <w:b/>
-          <w:bCs/>
-        </w:rPr>
-        <w:t xml:space="preserve">社区基金地址</w:t>
-      </w:r>
-      <w:r>
-        <w:t xml:space="preserve">：</w:t>
-      </w:r>
-      <w:r>
-        <w:rPr>
-          <w:rStyle w:val="VerbatimChar"/>
-        </w:rPr>
-        <w:t xml:space="preserve">0xb11b018c1d6f093cbe5e50e76fd9ed4c70f90c79</w:t>
-      </w:r>
-      <w:r>
-        <w:t xml:space="preserve">。</w:t>
-      </w:r>
-    </w:p>
-    <w:p>
-      <w:pPr>
-        <w:pStyle w:val="Compact"/>
-        <w:numPr>
-          <w:ilvl w:val="0"/>
-          <w:numId w:val="1011"/>
-        </w:numPr>
-      </w:pPr>
-      <w:r>
-        <w:rPr>
-          <w:b/>
-          <w:bCs/>
-        </w:rPr>
-        <w:t xml:space="preserve">空投预留账号（示例，可换成正式账号）</w:t>
-      </w:r>
-      <w:r>
-        <w:t xml:space="preserve">：</w:t>
-      </w:r>
-    </w:p>
-    <w:p>
-      <w:pPr>
-        <w:pStyle w:val="Compact"/>
-        <w:numPr>
-          <w:ilvl w:val="1"/>
+        <w:t xml:space="preserve">5. 邀请列表</w:t>
+      </w:r>
+    </w:p>
+    <w:p>
+      <w:pPr>
+        <w:pStyle w:val="Compact"/>
+        <w:numPr>
+          <w:ilvl w:val="0"/>
           <w:numId w:val="1012"/>
         </w:numPr>
       </w:pPr>
       <w:r>
-        <w:rPr>
-          <w:rStyle w:val="VerbatimChar"/>
-        </w:rPr>
-        <w:t xml:space="preserve">0x9e77389505ccd3d89e11109b3ec96d8458603ffe</w:t>
-      </w:r>
-      <w:r>
-        <w:br/>
-      </w:r>
-    </w:p>
-    <w:p>
-      <w:pPr>
-        <w:pStyle w:val="Compact"/>
-        <w:numPr>
-          <w:ilvl w:val="1"/>
-          <w:numId w:val="1012"/>
-        </w:numPr>
-      </w:pPr>
-      <w:r>
-        <w:rPr>
-          <w:rStyle w:val="VerbatimChar"/>
-        </w:rPr>
-        <w:t xml:space="preserve">0xdf122a018c12d6129205f98a8c8758f4f2ff37c3</w:t>
-      </w:r>
-      <w:r>
-        <w:br/>
-      </w:r>
-    </w:p>
-    <w:p>
-      <w:pPr>
-        <w:pStyle w:val="Compact"/>
-        <w:numPr>
-          <w:ilvl w:val="1"/>
-          <w:numId w:val="1012"/>
-        </w:numPr>
-      </w:pPr>
-      <w:r>
-        <w:rPr>
-          <w:rStyle w:val="VerbatimChar"/>
-        </w:rPr>
-        <w:t xml:space="preserve">0x02b6438f76d32d6195f25e122af0a71d9067f9f8</w:t>
+        <w:t xml:space="preserve">进入「邀请玩家」选项卡，可分页查看直推和间推地址，方便管理团队关系。</w:t>
       </w:r>
     </w:p>
     <w:p>
@@ -1044,7 +1188,7 @@
         <w:pStyle w:val="FirstParagraph"/>
       </w:pPr>
       <w:r>
-        <w:t xml:space="preserve">后台示例：</w:t>
+        <w:t xml:space="preserve">界面示例：</w:t>
       </w:r>
       <w:r>
         <w:br/>
@@ -1054,18 +1198,18 @@
           <wp:inline>
             <wp:extent cx="5334000" cy="11559778"/>
             <wp:effectExtent b="0" l="0" r="0" t="0"/>
-            <wp:docPr descr="管理员页面配置" title="" id="44" name="Picture"/>
+            <wp:docPr descr="邀请列表示例" title="" id="41" name="Picture"/>
             <a:graphic>
               <a:graphicData uri="http://schemas.openxmlformats.org/drawingml/2006/picture">
                 <pic:pic>
                   <pic:nvPicPr>
-                    <pic:cNvPr descr="pic/管理员页面1.png" id="45" name="Picture"/>
+                    <pic:cNvPr descr="pic/推荐列表.jpg" id="42" name="Picture"/>
                     <pic:cNvPicPr>
                       <a:picLocks noChangeArrowheads="1" noChangeAspect="1"/>
                     </pic:cNvPicPr>
                   </pic:nvPicPr>
                   <pic:blipFill>
-                    <a:blip r:embed="rId43"/>
+                    <a:blip r:embed="rId40"/>
                     <a:stretch>
                       <a:fillRect/>
                     </a:stretch>
@@ -1091,6 +1235,246 @@
           </wp:inline>
         </w:drawing>
       </w:r>
+    </w:p>
+    <w:p>
+      <w:r>
+        <w:pict>
+          <v:rect style="width:0;height:1.5pt" o:hralign="center" o:hrstd="t" o:hr="t"/>
+        </w:pict>
+      </w:r>
+    </w:p>
+    <w:bookmarkEnd w:id="43"/>
+    <w:bookmarkEnd w:id="44"/>
+    <w:bookmarkStart w:id="56" w:name="管理员流程"/>
+    <w:p>
+      <w:pPr>
+        <w:pStyle w:val="Heading2"/>
+      </w:pPr>
+      <w:r>
+        <w:t xml:space="preserve">管理员流程</w:t>
+      </w:r>
+    </w:p>
+    <w:bookmarkStart w:id="45" w:name="连接后台"/>
+    <w:p>
+      <w:pPr>
+        <w:pStyle w:val="Heading3"/>
+      </w:pPr>
+      <w:r>
+        <w:t xml:space="preserve">1. 连接后台</w:t>
+      </w:r>
+    </w:p>
+    <w:p>
+      <w:pPr>
+        <w:pStyle w:val="Compact"/>
+        <w:numPr>
+          <w:ilvl w:val="0"/>
+          <w:numId w:val="1013"/>
+        </w:numPr>
+      </w:pPr>
+      <w:r>
+        <w:t xml:space="preserve">使用 Owner 钱包访问管理员端并点击「连接钱包」。非 Owner 无法编辑参数。</w:t>
+      </w:r>
+    </w:p>
+    <w:bookmarkEnd w:id="45"/>
+    <w:bookmarkStart w:id="52" w:name="基本配置"/>
+    <w:p>
+      <w:pPr>
+        <w:pStyle w:val="Heading3"/>
+      </w:pPr>
+      <w:r>
+        <w:t xml:space="preserve">2. 基本配置</w:t>
+      </w:r>
+    </w:p>
+    <w:p>
+      <w:pPr>
+        <w:pStyle w:val="Compact"/>
+        <w:numPr>
+          <w:ilvl w:val="0"/>
+          <w:numId w:val="1014"/>
+        </w:numPr>
+      </w:pPr>
+      <w:r>
+        <w:rPr>
+          <w:b/>
+          <w:bCs/>
+        </w:rPr>
+        <w:t xml:space="preserve">票价参数</w:t>
+      </w:r>
+      <w:r>
+        <w:t xml:space="preserve">：可调整基础价与递增价（默认 0.001 / 0.001）。</w:t>
+      </w:r>
+    </w:p>
+    <w:p>
+      <w:pPr>
+        <w:pStyle w:val="Compact"/>
+        <w:numPr>
+          <w:ilvl w:val="0"/>
+          <w:numId w:val="1014"/>
+        </w:numPr>
+      </w:pPr>
+      <w:r>
+        <w:rPr>
+          <w:b/>
+          <w:bCs/>
+        </w:rPr>
+        <w:t xml:space="preserve">回合时间/冷却时间</w:t>
+      </w:r>
+      <w:r>
+        <w:t xml:space="preserve">：默认 24 小时 / 1 小时，可按需求修改。</w:t>
+      </w:r>
+    </w:p>
+    <w:p>
+      <w:pPr>
+        <w:pStyle w:val="Compact"/>
+        <w:numPr>
+          <w:ilvl w:val="0"/>
+          <w:numId w:val="1014"/>
+        </w:numPr>
+      </w:pPr>
+      <w:r>
+        <w:rPr>
+          <w:b/>
+          <w:bCs/>
+        </w:rPr>
+        <w:t xml:space="preserve">空投门槛</w:t>
+      </w:r>
+      <w:r>
+        <w:t xml:space="preserve">：默认 1 USDT。</w:t>
+      </w:r>
+    </w:p>
+    <w:p>
+      <w:pPr>
+        <w:pStyle w:val="Compact"/>
+        <w:numPr>
+          <w:ilvl w:val="0"/>
+          <w:numId w:val="1014"/>
+        </w:numPr>
+      </w:pPr>
+      <w:r>
+        <w:rPr>
+          <w:b/>
+          <w:bCs/>
+        </w:rPr>
+        <w:t xml:space="preserve">开发者国库地址</w:t>
+      </w:r>
+      <w:r>
+        <w:t xml:space="preserve">：</w:t>
+      </w:r>
+      <w:r>
+        <w:rPr>
+          <w:rStyle w:val="VerbatimChar"/>
+        </w:rPr>
+        <w:t xml:space="preserve">0x8224fbbdc261759cbf861c16394a9141c5575c25</w:t>
+      </w:r>
+      <w:r>
+        <w:t xml:space="preserve">。</w:t>
+      </w:r>
+    </w:p>
+    <w:p>
+      <w:pPr>
+        <w:pStyle w:val="Compact"/>
+        <w:numPr>
+          <w:ilvl w:val="0"/>
+          <w:numId w:val="1014"/>
+        </w:numPr>
+      </w:pPr>
+      <w:r>
+        <w:rPr>
+          <w:b/>
+          <w:bCs/>
+        </w:rPr>
+        <w:t xml:space="preserve">社区基金地址</w:t>
+      </w:r>
+      <w:r>
+        <w:t xml:space="preserve">：</w:t>
+      </w:r>
+      <w:r>
+        <w:rPr>
+          <w:rStyle w:val="VerbatimChar"/>
+        </w:rPr>
+        <w:t xml:space="preserve">0xb11b018c1d6f093cbe5e50e76fd9ed4c70f90c79</w:t>
+      </w:r>
+      <w:r>
+        <w:t xml:space="preserve">。</w:t>
+      </w:r>
+    </w:p>
+    <w:p>
+      <w:pPr>
+        <w:pStyle w:val="Compact"/>
+        <w:numPr>
+          <w:ilvl w:val="0"/>
+          <w:numId w:val="1014"/>
+        </w:numPr>
+      </w:pPr>
+      <w:r>
+        <w:rPr>
+          <w:b/>
+          <w:bCs/>
+        </w:rPr>
+        <w:t xml:space="preserve">空投预留账号（示例，可换成正式账号）</w:t>
+      </w:r>
+      <w:r>
+        <w:t xml:space="preserve">：</w:t>
+      </w:r>
+    </w:p>
+    <w:p>
+      <w:pPr>
+        <w:pStyle w:val="Compact"/>
+        <w:numPr>
+          <w:ilvl w:val="1"/>
+          <w:numId w:val="1015"/>
+        </w:numPr>
+      </w:pPr>
+      <w:r>
+        <w:rPr>
+          <w:rStyle w:val="VerbatimChar"/>
+        </w:rPr>
+        <w:t xml:space="preserve">0x9e77389505ccd3d89e11109b3ec96d8458603ffe</w:t>
+      </w:r>
+      <w:r>
+        <w:br/>
+      </w:r>
+    </w:p>
+    <w:p>
+      <w:pPr>
+        <w:pStyle w:val="Compact"/>
+        <w:numPr>
+          <w:ilvl w:val="1"/>
+          <w:numId w:val="1015"/>
+        </w:numPr>
+      </w:pPr>
+      <w:r>
+        <w:rPr>
+          <w:rStyle w:val="VerbatimChar"/>
+        </w:rPr>
+        <w:t xml:space="preserve">0xdf122a018c12d6129205f98a8c8758f4f2ff37c3</w:t>
+      </w:r>
+      <w:r>
+        <w:br/>
+      </w:r>
+    </w:p>
+    <w:p>
+      <w:pPr>
+        <w:pStyle w:val="Compact"/>
+        <w:numPr>
+          <w:ilvl w:val="1"/>
+          <w:numId w:val="1015"/>
+        </w:numPr>
+      </w:pPr>
+      <w:r>
+        <w:rPr>
+          <w:rStyle w:val="VerbatimChar"/>
+        </w:rPr>
+        <w:t xml:space="preserve">0x02b6438f76d32d6195f25e122af0a71d9067f9f8</w:t>
+      </w:r>
+    </w:p>
+    <w:p>
+      <w:pPr>
+        <w:pStyle w:val="FirstParagraph"/>
+      </w:pPr>
+      <w:r>
+        <w:t xml:space="preserve">后台示例：</w:t>
+      </w:r>
       <w:r>
         <w:br/>
       </w:r>
@@ -1099,12 +1483,12 @@
           <wp:inline>
             <wp:extent cx="5334000" cy="11559778"/>
             <wp:effectExtent b="0" l="0" r="0" t="0"/>
-            <wp:docPr descr="管理员页面操作" title="" id="47" name="Picture"/>
+            <wp:docPr descr="管理员页面配置" title="" id="47" name="Picture"/>
             <a:graphic>
               <a:graphicData uri="http://schemas.openxmlformats.org/drawingml/2006/picture">
                 <pic:pic>
                   <pic:nvPicPr>
-                    <pic:cNvPr descr="pic/管理员页面2.png" id="48" name="Picture"/>
+                    <pic:cNvPr descr="pic/管理员页面1.png" id="48" name="Picture"/>
                     <pic:cNvPicPr>
                       <a:picLocks noChangeArrowheads="1" noChangeAspect="1"/>
                     </pic:cNvPicPr>
@@ -1136,9 +1520,54 @@
           </wp:inline>
         </w:drawing>
       </w:r>
-    </w:p>
-    <w:bookmarkEnd w:id="49"/>
-    <w:bookmarkStart w:id="50" w:name="注资与回收"/>
+      <w:r>
+        <w:br/>
+      </w:r>
+      <w:r>
+        <w:drawing>
+          <wp:inline>
+            <wp:extent cx="5334000" cy="11559778"/>
+            <wp:effectExtent b="0" l="0" r="0" t="0"/>
+            <wp:docPr descr="管理员页面操作" title="" id="50" name="Picture"/>
+            <a:graphic>
+              <a:graphicData uri="http://schemas.openxmlformats.org/drawingml/2006/picture">
+                <pic:pic>
+                  <pic:nvPicPr>
+                    <pic:cNvPr descr="pic/管理员页面2.png" id="51" name="Picture"/>
+                    <pic:cNvPicPr>
+                      <a:picLocks noChangeArrowheads="1" noChangeAspect="1"/>
+                    </pic:cNvPicPr>
+                  </pic:nvPicPr>
+                  <pic:blipFill>
+                    <a:blip r:embed="rId49"/>
+                    <a:stretch>
+                      <a:fillRect/>
+                    </a:stretch>
+                  </pic:blipFill>
+                  <pic:spPr bwMode="auto">
+                    <a:xfrm>
+                      <a:off x="0" y="0"/>
+                      <a:ext cx="5334000" cy="11559778"/>
+                    </a:xfrm>
+                    <a:prstGeom prst="rect">
+                      <a:avLst/>
+                    </a:prstGeom>
+                    <a:noFill/>
+                    <a:ln w="9525">
+                      <a:noFill/>
+                      <a:headEnd/>
+                      <a:tailEnd/>
+                    </a:ln>
+                  </pic:spPr>
+                </pic:pic>
+              </a:graphicData>
+            </a:graphic>
+          </wp:inline>
+        </w:drawing>
+      </w:r>
+    </w:p>
+    <w:bookmarkEnd w:id="52"/>
+    <w:bookmarkStart w:id="53" w:name="注资与回收"/>
     <w:p>
       <w:pPr>
         <w:pStyle w:val="Heading3"/>
@@ -1152,7 +1581,7 @@
         <w:pStyle w:val="Compact"/>
         <w:numPr>
           <w:ilvl w:val="0"/>
-          <w:numId w:val="1013"/>
+          <w:numId w:val="1016"/>
         </w:numPr>
       </w:pPr>
       <w:r>
@@ -1164,15 +1593,15 @@
         <w:pStyle w:val="Compact"/>
         <w:numPr>
           <w:ilvl w:val="0"/>
-          <w:numId w:val="1013"/>
+          <w:numId w:val="1016"/>
         </w:numPr>
       </w:pPr>
       <w:r>
         <w:t xml:space="preserve">「回收合约中的任意代币」：输入代币地址与数量，执行后可将合约中多余资产转回管理员钱包。</w:t>
       </w:r>
     </w:p>
-    <w:bookmarkEnd w:id="50"/>
-    <w:bookmarkStart w:id="51" w:name="回合管理"/>
+    <w:bookmarkEnd w:id="53"/>
+    <w:bookmarkStart w:id="54" w:name="回合管理"/>
     <w:p>
       <w:pPr>
         <w:pStyle w:val="Heading3"/>
@@ -1186,7 +1615,7 @@
         <w:pStyle w:val="Compact"/>
         <w:numPr>
           <w:ilvl w:val="0"/>
-          <w:numId w:val="1014"/>
+          <w:numId w:val="1017"/>
         </w:numPr>
       </w:pPr>
       <w:r>
@@ -1198,7 +1627,7 @@
         <w:pStyle w:val="Compact"/>
         <w:numPr>
           <w:ilvl w:val="0"/>
-          <w:numId w:val="1014"/>
+          <w:numId w:val="1017"/>
         </w:numPr>
       </w:pPr>
       <w:r>
@@ -1210,15 +1639,15 @@
         <w:pStyle w:val="Compact"/>
         <w:numPr>
           <w:ilvl w:val="0"/>
-          <w:numId w:val="1014"/>
+          <w:numId w:val="1017"/>
         </w:numPr>
       </w:pPr>
       <w:r>
         <w:t xml:space="preserve">当 25% 排行榜奖励发放完毕，新一轮的排行榜会自动清零、重新统计。</w:t>
       </w:r>
     </w:p>
-    <w:bookmarkEnd w:id="51"/>
-    <w:bookmarkStart w:id="52" w:name="切换空投代币如有需要"/>
+    <w:bookmarkEnd w:id="54"/>
+    <w:bookmarkStart w:id="55" w:name="切换空投代币如有需要"/>
     <w:p>
       <w:pPr>
         <w:pStyle w:val="Heading3"/>
@@ -1232,7 +1661,7 @@
         <w:pStyle w:val="Compact"/>
         <w:numPr>
           <w:ilvl w:val="0"/>
-          <w:numId w:val="1015"/>
+          <w:numId w:val="1018"/>
         </w:numPr>
       </w:pPr>
       <w:r>
@@ -1259,7 +1688,7 @@
         <w:pStyle w:val="Compact"/>
         <w:numPr>
           <w:ilvl w:val="0"/>
-          <w:numId w:val="1015"/>
+          <w:numId w:val="1018"/>
         </w:numPr>
       </w:pPr>
       <w:r>
@@ -1271,7 +1700,7 @@
         <w:pStyle w:val="Compact"/>
         <w:numPr>
           <w:ilvl w:val="0"/>
-          <w:numId w:val="1015"/>
+          <w:numId w:val="1018"/>
         </w:numPr>
       </w:pPr>
       <w:r>
@@ -1291,442 +1720,6 @@
       </w:pPr>
       <w:r>
         <w:t xml:space="preserve">通过以上步骤，即可完成完整的玩家购票、收益查看、空投领取流程，以及管理员的调参、注资、结算与新轮开启。整个操作不需要修改代码，只需按照页面提示点击对应按钮即可。</w:t>
-      </w:r>
-    </w:p>
-    <w:p>
-      <w:r>
-        <w:pict>
-          <v:rect style="width:0;height:1.5pt" o:hralign="center" o:hrstd="t" o:hr="t"/>
-        </w:pict>
-      </w:r>
-    </w:p>
-    <w:bookmarkEnd w:id="52"/>
-    <w:bookmarkEnd w:id="53"/>
-    <w:bookmarkStart w:id="56" w:name="测试数据与地址请勿暴露生产环境"/>
-    <w:p>
-      <w:pPr>
-        <w:pStyle w:val="Heading2"/>
-      </w:pPr>
-      <w:r>
-        <w:t xml:space="preserve">测试数据与地址（请勿暴露生产环境）</w:t>
-      </w:r>
-    </w:p>
-    <w:p>
-      <w:pPr>
-        <w:pStyle w:val="BlockText"/>
-      </w:pPr>
-      <w:r>
-        <w:t xml:space="preserve">仅供测试使用，包含私钥和敏感地址，请勿泄露或在主网使用。</w:t>
-      </w:r>
-    </w:p>
-    <w:p>
-      <w:pPr>
-        <w:pStyle w:val="Compact"/>
-        <w:numPr>
-          <w:ilvl w:val="0"/>
-          <w:numId w:val="1016"/>
-        </w:numPr>
-      </w:pPr>
-      <w:r>
-        <w:rPr>
-          <w:b/>
-          <w:bCs/>
-        </w:rPr>
-        <w:t xml:space="preserve">管理员地址</w:t>
-      </w:r>
-      <w:r>
-        <w:t xml:space="preserve">：</w:t>
-      </w:r>
-      <w:r>
-        <w:rPr>
-          <w:rStyle w:val="VerbatimChar"/>
-        </w:rPr>
-        <w:t xml:space="preserve">0x6c62d0c68071335f6fdf7bfe7d866659ad1b0061</w:t>
-      </w:r>
-      <w:r>
-        <w:br/>
-      </w:r>
-      <w:r>
-        <w:rPr>
-          <w:b/>
-          <w:bCs/>
-        </w:rPr>
-        <w:t xml:space="preserve">管理员私钥</w:t>
-      </w:r>
-      <w:r>
-        <w:t xml:space="preserve">：</w:t>
-      </w:r>
-      <w:r>
-        <w:rPr>
-          <w:rStyle w:val="VerbatimChar"/>
-        </w:rPr>
-        <w:t xml:space="preserve">7cc046fe6c3a6528d9861d1d162edadb90cd818a584c705d172b7d619bdde140</w:t>
-      </w:r>
-    </w:p>
-    <w:p>
-      <w:pPr>
-        <w:pStyle w:val="Compact"/>
-        <w:numPr>
-          <w:ilvl w:val="0"/>
-          <w:numId w:val="1016"/>
-        </w:numPr>
-      </w:pPr>
-      <w:r>
-        <w:rPr>
-          <w:b/>
-          <w:bCs/>
-        </w:rPr>
-        <w:t xml:space="preserve">开发者国库地址</w:t>
-      </w:r>
-      <w:r>
-        <w:t xml:space="preserve">：</w:t>
-      </w:r>
-      <w:r>
-        <w:rPr>
-          <w:rStyle w:val="VerbatimChar"/>
-        </w:rPr>
-        <w:t xml:space="preserve">0x8224fbbdc261759cbf861c16394a9141c5575c25</w:t>
-      </w:r>
-      <w:r>
-        <w:br/>
-      </w:r>
-      <w:r>
-        <w:rPr>
-          <w:b/>
-          <w:bCs/>
-        </w:rPr>
-        <w:t xml:space="preserve">私钥</w:t>
-      </w:r>
-      <w:r>
-        <w:t xml:space="preserve">：</w:t>
-      </w:r>
-      <w:r>
-        <w:rPr>
-          <w:rStyle w:val="VerbatimChar"/>
-        </w:rPr>
-        <w:t xml:space="preserve">d74168aed1725675c2041c4d34bdfa32530ee6575241354ef6b84963a571e59c</w:t>
-      </w:r>
-    </w:p>
-    <w:p>
-      <w:pPr>
-        <w:pStyle w:val="Compact"/>
-        <w:numPr>
-          <w:ilvl w:val="0"/>
-          <w:numId w:val="1016"/>
-        </w:numPr>
-      </w:pPr>
-      <w:r>
-        <w:rPr>
-          <w:b/>
-          <w:bCs/>
-        </w:rPr>
-        <w:t xml:space="preserve">社区基金地址</w:t>
-      </w:r>
-      <w:r>
-        <w:t xml:space="preserve">：</w:t>
-      </w:r>
-      <w:r>
-        <w:rPr>
-          <w:rStyle w:val="VerbatimChar"/>
-        </w:rPr>
-        <w:t xml:space="preserve">0xb11b018c1d6f093cbe5e50e76fd9ed4c70f90c79</w:t>
-      </w:r>
-      <w:r>
-        <w:br/>
-      </w:r>
-      <w:r>
-        <w:rPr>
-          <w:b/>
-          <w:bCs/>
-        </w:rPr>
-        <w:t xml:space="preserve">私钥</w:t>
-      </w:r>
-      <w:r>
-        <w:t xml:space="preserve">：</w:t>
-      </w:r>
-      <w:r>
-        <w:rPr>
-          <w:rStyle w:val="VerbatimChar"/>
-        </w:rPr>
-        <w:t xml:space="preserve">9e7d9b96c2306237b8c1ff8ee4094c03761b835f183f6519b3a7567f7c4bcd02</w:t>
-      </w:r>
-    </w:p>
-    <w:p>
-      <w:pPr>
-        <w:pStyle w:val="Compact"/>
-        <w:numPr>
-          <w:ilvl w:val="0"/>
-          <w:numId w:val="1016"/>
-        </w:numPr>
-      </w:pPr>
-      <w:r>
-        <w:rPr>
-          <w:b/>
-          <w:bCs/>
-        </w:rPr>
-        <w:t xml:space="preserve">USDT 测试代币地址</w:t>
-      </w:r>
-      <w:r>
-        <w:t xml:space="preserve">：</w:t>
-      </w:r>
-      <w:r>
-        <w:rPr>
-          <w:rStyle w:val="VerbatimChar"/>
-        </w:rPr>
-        <w:t xml:space="preserve">0x26dd16D5B9708032872a7cD10C100b0FcE4E79a9</w:t>
-      </w:r>
-    </w:p>
-    <w:bookmarkStart w:id="54" w:name="推荐关系测试地址"/>
-    <w:p>
-      <w:pPr>
-        <w:pStyle w:val="Heading3"/>
-      </w:pPr>
-      <w:r>
-        <w:t xml:space="preserve">推荐关系测试地址</w:t>
-      </w:r>
-    </w:p>
-    <w:p>
-      <w:pPr>
-        <w:pStyle w:val="Compact"/>
-        <w:numPr>
-          <w:ilvl w:val="0"/>
-          <w:numId w:val="1017"/>
-        </w:numPr>
-      </w:pPr>
-      <w:r>
-        <w:rPr>
-          <w:b/>
-          <w:bCs/>
-        </w:rPr>
-        <w:t xml:space="preserve">买票人</w:t>
-      </w:r>
-      <w:r>
-        <w:t xml:space="preserve">：</w:t>
-      </w:r>
-      <w:r>
-        <w:rPr>
-          <w:rStyle w:val="VerbatimChar"/>
-        </w:rPr>
-        <w:t xml:space="preserve">0x122e268a49b3b617af62be87393b214894c7a674</w:t>
-      </w:r>
-      <w:r>
-        <w:br/>
-      </w:r>
-      <w:r>
-        <w:rPr>
-          <w:b/>
-          <w:bCs/>
-        </w:rPr>
-        <w:t xml:space="preserve">私钥</w:t>
-      </w:r>
-      <w:r>
-        <w:t xml:space="preserve">：</w:t>
-      </w:r>
-      <w:r>
-        <w:rPr>
-          <w:rStyle w:val="VerbatimChar"/>
-        </w:rPr>
-        <w:t xml:space="preserve">89cc918e6bdb4c46c49c8a3c5f2807f98f55109fa64d088fcbdef6099a47a89a</w:t>
-      </w:r>
-    </w:p>
-    <w:p>
-      <w:pPr>
-        <w:pStyle w:val="Compact"/>
-        <w:numPr>
-          <w:ilvl w:val="0"/>
-          <w:numId w:val="1017"/>
-        </w:numPr>
-      </w:pPr>
-      <w:r>
-        <w:rPr>
-          <w:b/>
-          <w:bCs/>
-        </w:rPr>
-        <w:t xml:space="preserve">邀请人（直推）</w:t>
-      </w:r>
-      <w:r>
-        <w:t xml:space="preserve">：</w:t>
-      </w:r>
-      <w:r>
-        <w:rPr>
-          <w:rStyle w:val="VerbatimChar"/>
-        </w:rPr>
-        <w:t xml:space="preserve">0x2cf5446b1d01fbf0be6e895f1c26b2a6a40ad3d7</w:t>
-      </w:r>
-      <w:r>
-        <w:br/>
-      </w:r>
-      <w:r>
-        <w:rPr>
-          <w:b/>
-          <w:bCs/>
-        </w:rPr>
-        <w:t xml:space="preserve">私钥</w:t>
-      </w:r>
-      <w:r>
-        <w:t xml:space="preserve">：</w:t>
-      </w:r>
-      <w:r>
-        <w:rPr>
-          <w:rStyle w:val="VerbatimChar"/>
-        </w:rPr>
-        <w:t xml:space="preserve">113f848e2c433dcefd7bd62227fcda34269e12f138ebf430189277a63ecbdacb</w:t>
-      </w:r>
-    </w:p>
-    <w:p>
-      <w:pPr>
-        <w:pStyle w:val="Compact"/>
-        <w:numPr>
-          <w:ilvl w:val="0"/>
-          <w:numId w:val="1017"/>
-        </w:numPr>
-      </w:pPr>
-      <w:r>
-        <w:rPr>
-          <w:b/>
-          <w:bCs/>
-        </w:rPr>
-        <w:t xml:space="preserve">间接邀请人</w:t>
-      </w:r>
-      <w:r>
-        <w:t xml:space="preserve">：</w:t>
-      </w:r>
-      <w:r>
-        <w:rPr>
-          <w:rStyle w:val="VerbatimChar"/>
-        </w:rPr>
-        <w:t xml:space="preserve">0xb8ee25e6f4e993406180fe9fdfca0c935605a39c</w:t>
-      </w:r>
-      <w:r>
-        <w:br/>
-      </w:r>
-      <w:r>
-        <w:rPr>
-          <w:b/>
-          <w:bCs/>
-        </w:rPr>
-        <w:t xml:space="preserve">私钥</w:t>
-      </w:r>
-      <w:r>
-        <w:t xml:space="preserve">：</w:t>
-      </w:r>
-      <w:r>
-        <w:rPr>
-          <w:rStyle w:val="VerbatimChar"/>
-        </w:rPr>
-        <w:t xml:space="preserve">fa3cdf14159a270ca6da44567b3d99dfcbe007f42b8bceab62e01110fc57ba84</w:t>
-      </w:r>
-    </w:p>
-    <w:bookmarkEnd w:id="54"/>
-    <w:bookmarkStart w:id="55" w:name="管理员预置空投地址"/>
-    <w:p>
-      <w:pPr>
-        <w:pStyle w:val="Heading3"/>
-      </w:pPr>
-      <w:r>
-        <w:t xml:space="preserve">管理员预置空投地址</w:t>
-      </w:r>
-    </w:p>
-    <w:p>
-      <w:pPr>
-        <w:pStyle w:val="Compact"/>
-        <w:numPr>
-          <w:ilvl w:val="0"/>
-          <w:numId w:val="1018"/>
-        </w:numPr>
-      </w:pPr>
-      <w:r>
-        <w:rPr>
-          <w:rStyle w:val="VerbatimChar"/>
-        </w:rPr>
-        <w:t xml:space="preserve">0x9e77389505ccd3d89e11109b3ec96d8458603ffe</w:t>
-      </w:r>
-      <w:r>
-        <w:br/>
-      </w:r>
-      <w:r>
-        <w:rPr>
-          <w:b/>
-          <w:bCs/>
-        </w:rPr>
-        <w:t xml:space="preserve">私钥</w:t>
-      </w:r>
-      <w:r>
-        <w:t xml:space="preserve">：</w:t>
-      </w:r>
-      <w:r>
-        <w:rPr>
-          <w:rStyle w:val="VerbatimChar"/>
-        </w:rPr>
-        <w:t xml:space="preserve">418fd094258cd4f17e8ad197fe07e15321c3f07deac1b59cea98cf6342ae4549</w:t>
-      </w:r>
-    </w:p>
-    <w:p>
-      <w:pPr>
-        <w:pStyle w:val="Compact"/>
-        <w:numPr>
-          <w:ilvl w:val="0"/>
-          <w:numId w:val="1018"/>
-        </w:numPr>
-      </w:pPr>
-      <w:r>
-        <w:rPr>
-          <w:rStyle w:val="VerbatimChar"/>
-        </w:rPr>
-        <w:t xml:space="preserve">0xdf122a018c12d6129205f98a8c8758f4f2ff37c3</w:t>
-      </w:r>
-      <w:r>
-        <w:br/>
-      </w:r>
-      <w:r>
-        <w:rPr>
-          <w:b/>
-          <w:bCs/>
-        </w:rPr>
-        <w:t xml:space="preserve">私钥</w:t>
-      </w:r>
-      <w:r>
-        <w:t xml:space="preserve">：</w:t>
-      </w:r>
-      <w:r>
-        <w:rPr>
-          <w:rStyle w:val="VerbatimChar"/>
-        </w:rPr>
-        <w:t xml:space="preserve">1fe977553945e7a7d960654020cb8b378229bf42607ad174616732ba04886533</w:t>
-      </w:r>
-    </w:p>
-    <w:p>
-      <w:pPr>
-        <w:pStyle w:val="Compact"/>
-        <w:numPr>
-          <w:ilvl w:val="0"/>
-          <w:numId w:val="1018"/>
-        </w:numPr>
-      </w:pPr>
-      <w:r>
-        <w:rPr>
-          <w:rStyle w:val="VerbatimChar"/>
-        </w:rPr>
-        <w:t xml:space="preserve">0x02b6438f76d32d6195f25e122af0a71d9067f9f8</w:t>
-      </w:r>
-      <w:r>
-        <w:br/>
-      </w:r>
-      <w:r>
-        <w:rPr>
-          <w:b/>
-          <w:bCs/>
-        </w:rPr>
-        <w:t xml:space="preserve">私钥</w:t>
-      </w:r>
-      <w:r>
-        <w:t xml:space="preserve">：</w:t>
-      </w:r>
-      <w:r>
-        <w:rPr>
-          <w:rStyle w:val="VerbatimChar"/>
-        </w:rPr>
-        <w:t xml:space="preserve">93bc67ddaea266c3fcba97d2fd146972d8f60d52d5e4cc0d0e7cdb5604cab442</w:t>
       </w:r>
     </w:p>
     <w:bookmarkEnd w:id="55"/>
@@ -2009,37 +2002,37 @@
     <w:abstractNumId w:val="991"/>
   </w:num>
   <w:num w:numId="1003">
-    <w:abstractNumId w:val="991"/>
+    <w:abstractNumId w:val="99411"/>
+    <w:lvlOverride w:ilvl="0">
+      <w:startOverride w:val="1"/>
+    </w:lvlOverride>
+    <w:lvlOverride w:ilvl="1">
+      <w:startOverride w:val="1"/>
+    </w:lvlOverride>
+    <w:lvlOverride w:ilvl="2">
+      <w:startOverride w:val="1"/>
+    </w:lvlOverride>
+    <w:lvlOverride w:ilvl="3">
+      <w:startOverride w:val="1"/>
+    </w:lvlOverride>
+    <w:lvlOverride w:ilvl="4">
+      <w:startOverride w:val="1"/>
+    </w:lvlOverride>
+    <w:lvlOverride w:ilvl="5">
+      <w:startOverride w:val="1"/>
+    </w:lvlOverride>
+    <w:lvlOverride w:ilvl="6">
+      <w:startOverride w:val="1"/>
+    </w:lvlOverride>
+    <w:lvlOverride w:ilvl="7">
+      <w:startOverride w:val="1"/>
+    </w:lvlOverride>
+    <w:lvlOverride w:ilvl="8">
+      <w:startOverride w:val="1"/>
+    </w:lvlOverride>
   </w:num>
   <w:num w:numId="1004">
-    <w:abstractNumId w:val="99411"/>
-    <w:lvlOverride w:ilvl="0">
-      <w:startOverride w:val="1"/>
-    </w:lvlOverride>
-    <w:lvlOverride w:ilvl="1">
-      <w:startOverride w:val="1"/>
-    </w:lvlOverride>
-    <w:lvlOverride w:ilvl="2">
-      <w:startOverride w:val="1"/>
-    </w:lvlOverride>
-    <w:lvlOverride w:ilvl="3">
-      <w:startOverride w:val="1"/>
-    </w:lvlOverride>
-    <w:lvlOverride w:ilvl="4">
-      <w:startOverride w:val="1"/>
-    </w:lvlOverride>
-    <w:lvlOverride w:ilvl="5">
-      <w:startOverride w:val="1"/>
-    </w:lvlOverride>
-    <w:lvlOverride w:ilvl="6">
-      <w:startOverride w:val="1"/>
-    </w:lvlOverride>
-    <w:lvlOverride w:ilvl="7">
-      <w:startOverride w:val="1"/>
-    </w:lvlOverride>
-    <w:lvlOverride w:ilvl="8">
-      <w:startOverride w:val="1"/>
-    </w:lvlOverride>
+    <w:abstractNumId w:val="991"/>
   </w:num>
   <w:num w:numId="1005">
     <w:abstractNumId w:val="991"/>
@@ -2048,7 +2041,34 @@
     <w:abstractNumId w:val="991"/>
   </w:num>
   <w:num w:numId="1007">
-    <w:abstractNumId w:val="991"/>
+    <w:abstractNumId w:val="99411"/>
+    <w:lvlOverride w:ilvl="0">
+      <w:startOverride w:val="1"/>
+    </w:lvlOverride>
+    <w:lvlOverride w:ilvl="1">
+      <w:startOverride w:val="1"/>
+    </w:lvlOverride>
+    <w:lvlOverride w:ilvl="2">
+      <w:startOverride w:val="1"/>
+    </w:lvlOverride>
+    <w:lvlOverride w:ilvl="3">
+      <w:startOverride w:val="1"/>
+    </w:lvlOverride>
+    <w:lvlOverride w:ilvl="4">
+      <w:startOverride w:val="1"/>
+    </w:lvlOverride>
+    <w:lvlOverride w:ilvl="5">
+      <w:startOverride w:val="1"/>
+    </w:lvlOverride>
+    <w:lvlOverride w:ilvl="6">
+      <w:startOverride w:val="1"/>
+    </w:lvlOverride>
+    <w:lvlOverride w:ilvl="7">
+      <w:startOverride w:val="1"/>
+    </w:lvlOverride>
+    <w:lvlOverride w:ilvl="8">
+      <w:startOverride w:val="1"/>
+    </w:lvlOverride>
   </w:num>
   <w:num w:numId="1008">
     <w:abstractNumId w:val="991"/>
@@ -2063,67 +2083,13 @@
     <w:abstractNumId w:val="991"/>
   </w:num>
   <w:num w:numId="1012">
-    <w:abstractNumId w:val="99411"/>
-    <w:lvlOverride w:ilvl="0">
-      <w:startOverride w:val="1"/>
-    </w:lvlOverride>
-    <w:lvlOverride w:ilvl="1">
-      <w:startOverride w:val="1"/>
-    </w:lvlOverride>
-    <w:lvlOverride w:ilvl="2">
-      <w:startOverride w:val="1"/>
-    </w:lvlOverride>
-    <w:lvlOverride w:ilvl="3">
-      <w:startOverride w:val="1"/>
-    </w:lvlOverride>
-    <w:lvlOverride w:ilvl="4">
-      <w:startOverride w:val="1"/>
-    </w:lvlOverride>
-    <w:lvlOverride w:ilvl="5">
-      <w:startOverride w:val="1"/>
-    </w:lvlOverride>
-    <w:lvlOverride w:ilvl="6">
-      <w:startOverride w:val="1"/>
-    </w:lvlOverride>
-    <w:lvlOverride w:ilvl="7">
-      <w:startOverride w:val="1"/>
-    </w:lvlOverride>
-    <w:lvlOverride w:ilvl="8">
-      <w:startOverride w:val="1"/>
-    </w:lvlOverride>
+    <w:abstractNumId w:val="991"/>
   </w:num>
   <w:num w:numId="1013">
     <w:abstractNumId w:val="991"/>
   </w:num>
   <w:num w:numId="1014">
-    <w:abstractNumId w:val="99411"/>
-    <w:lvlOverride w:ilvl="0">
-      <w:startOverride w:val="1"/>
-    </w:lvlOverride>
-    <w:lvlOverride w:ilvl="1">
-      <w:startOverride w:val="1"/>
-    </w:lvlOverride>
-    <w:lvlOverride w:ilvl="2">
-      <w:startOverride w:val="1"/>
-    </w:lvlOverride>
-    <w:lvlOverride w:ilvl="3">
-      <w:startOverride w:val="1"/>
-    </w:lvlOverride>
-    <w:lvlOverride w:ilvl="4">
-      <w:startOverride w:val="1"/>
-    </w:lvlOverride>
-    <w:lvlOverride w:ilvl="5">
-      <w:startOverride w:val="1"/>
-    </w:lvlOverride>
-    <w:lvlOverride w:ilvl="6">
-      <w:startOverride w:val="1"/>
-    </w:lvlOverride>
-    <w:lvlOverride w:ilvl="7">
-      <w:startOverride w:val="1"/>
-    </w:lvlOverride>
-    <w:lvlOverride w:ilvl="8">
-      <w:startOverride w:val="1"/>
-    </w:lvlOverride>
+    <w:abstractNumId w:val="991"/>
   </w:num>
   <w:num w:numId="1015">
     <w:abstractNumId w:val="99411"/>
@@ -2159,7 +2125,34 @@
     <w:abstractNumId w:val="991"/>
   </w:num>
   <w:num w:numId="1017">
-    <w:abstractNumId w:val="991"/>
+    <w:abstractNumId w:val="99411"/>
+    <w:lvlOverride w:ilvl="0">
+      <w:startOverride w:val="1"/>
+    </w:lvlOverride>
+    <w:lvlOverride w:ilvl="1">
+      <w:startOverride w:val="1"/>
+    </w:lvlOverride>
+    <w:lvlOverride w:ilvl="2">
+      <w:startOverride w:val="1"/>
+    </w:lvlOverride>
+    <w:lvlOverride w:ilvl="3">
+      <w:startOverride w:val="1"/>
+    </w:lvlOverride>
+    <w:lvlOverride w:ilvl="4">
+      <w:startOverride w:val="1"/>
+    </w:lvlOverride>
+    <w:lvlOverride w:ilvl="5">
+      <w:startOverride w:val="1"/>
+    </w:lvlOverride>
+    <w:lvlOverride w:ilvl="6">
+      <w:startOverride w:val="1"/>
+    </w:lvlOverride>
+    <w:lvlOverride w:ilvl="7">
+      <w:startOverride w:val="1"/>
+    </w:lvlOverride>
+    <w:lvlOverride w:ilvl="8">
+      <w:startOverride w:val="1"/>
+    </w:lvlOverride>
   </w:num>
   <w:num w:numId="1018">
     <w:abstractNumId w:val="99411"/>

</xml_diff>